<commit_message>
Refactor server reboot automation for Orchestrator transition
- Deleted the Change Register document for the Server Reboot Automation project.
- Implemented significant changes to the `cvs_functions.ps1` script, including:
  - Fixes for defects related to script execution and reboot status reporting.
  - Added new capabilities for verifying server reboots and generating per-server reports.
  - Introduced a new pre-reboot step embedded within the script to enhance security and reliability.
- Transitioned the automation process from Ansible to Orchestrator, streamlining execution and improving reporting mechanisms.
- Updated workflow schema to simplify execution flow and enhance clarity in reporting outcomes.
- Aligned documentation with the new workflow structure and removed deprecated inputs.
</commit_message>
<xml_diff>
--- a/Ansible to Orchestrator Transition/Completed/Server Reboots/Documentation/01_Executive_Summary.docx
+++ b/Ansible to Orchestrator Transition/Completed/Server Reboots/Documentation/01_Executive_Summary.docx
@@ -1,14 +1,13 @@
 
 <file path=word/document.xml><?xml version="1.0" encoding="utf-8"?>
-<w:document xmlns:w="http://schemas.openxmlformats.org/wordprocessingml/2006/main" xmlns:r="http://schemas.openxmlformats.org/officeDocument/2006/relationships">
+<w:document xmlns:wpc="http://schemas.microsoft.com/office/word/2010/wordprocessingCanvas" xmlns:cx="http://schemas.microsoft.com/office/drawing/2014/chartex" xmlns:cx1="http://schemas.microsoft.com/office/drawing/2015/9/8/chartex" xmlns:cx2="http://schemas.microsoft.com/office/drawing/2015/10/21/chartex" xmlns:cx3="http://schemas.microsoft.com/office/drawing/2016/5/9/chartex" xmlns:cx4="http://schemas.microsoft.com/office/drawing/2016/5/10/chartex" xmlns:cx5="http://schemas.microsoft.com/office/drawing/2016/5/11/chartex" xmlns:cx6="http://schemas.microsoft.com/office/drawing/2016/5/12/chartex" xmlns:cx7="http://schemas.microsoft.com/office/drawing/2016/5/13/chartex" xmlns:cx8="http://schemas.microsoft.com/office/drawing/2016/5/14/chartex" xmlns:mc="http://schemas.openxmlformats.org/markup-compatibility/2006" xmlns:aink="http://schemas.microsoft.com/office/drawing/2016/ink" xmlns:am3d="http://schemas.microsoft.com/office/drawing/2017/model3d" xmlns:o="urn:schemas-microsoft-com:office:office" xmlns:oel="http://schemas.microsoft.com/office/2019/extlst" xmlns:r="http://schemas.openxmlformats.org/officeDocument/2006/relationships" xmlns:m="http://schemas.openxmlformats.org/officeDocument/2006/math" xmlns:v="urn:schemas-microsoft-com:vml" xmlns:wp14="http://schemas.microsoft.com/office/word/2010/wordprocessingDrawing" xmlns:wp="http://schemas.openxmlformats.org/drawingml/2006/wordprocessingDrawing" xmlns:w10="urn:schemas-microsoft-com:office:word" xmlns:w="http://schemas.openxmlformats.org/wordprocessingml/2006/main" xmlns:w14="http://schemas.microsoft.com/office/word/2010/wordml" xmlns:w15="http://schemas.microsoft.com/office/word/2012/wordml" xmlns:w16cex="http://schemas.microsoft.com/office/word/2018/wordml/cex" xmlns:w16cid="http://schemas.microsoft.com/office/word/2016/wordml/cid" xmlns:w16="http://schemas.microsoft.com/office/word/2018/wordml" xmlns:w16du="http://schemas.microsoft.com/office/word/2023/wordml/word16du" xmlns:w16sdtdh="http://schemas.microsoft.com/office/word/2020/wordml/sdtdatahash" xmlns:w16sdtfl="http://schemas.microsoft.com/office/word/2024/wordml/sdtformatlock" xmlns:w16se="http://schemas.microsoft.com/office/word/2015/wordml/symex" xmlns:wpg="http://schemas.microsoft.com/office/word/2010/wordprocessingGroup" xmlns:wpi="http://schemas.microsoft.com/office/word/2010/wordprocessingInk" xmlns:wne="http://schemas.microsoft.com/office/word/2006/wordml" xmlns:wps="http://schemas.microsoft.com/office/word/2010/wordprocessingShape" mc:Ignorable="w14 w15 w16se w16cid w16 w16cex w16sdtdh w16sdtfl w16du wp14">
   <w:body>
     <w:p>
       <w:pPr>
         <w:pStyle w:val="Eyebrow"/>
       </w:pPr>
       <w:r>
-        <w:rPr/>
-        <w:t xml:space="preserve">Server Reboot Automation</w:t>
+        <w:t>Server Reboot Automation</w:t>
       </w:r>
     </w:p>
     <w:p>
@@ -16,32 +15,29 @@
         <w:pStyle w:val="Title"/>
       </w:pPr>
       <w:r>
-        <w:rPr/>
-        <w:t xml:space="preserve">Executive Summary</w:t>
+        <w:t>Executive Summary</w:t>
       </w:r>
     </w:p>
     <w:tbl>
       <w:tblPr>
         <w:tblStyle w:val="TableGrid"/>
         <w:tblW w:w="5000" w:type="pct"/>
+        <w:tblInd w:w="0" w:type="dxa"/>
         <w:tblBorders>
           <w:top w:val="single" w:sz="4" w:space="0" w:color="B2BDC7"/>
           <w:bottom w:val="single" w:sz="4" w:space="0" w:color="B2BDC7"/>
-          <w:left w:val="none" w:sz="0" w:space="0" w:color="auto"/>
-          <w:right w:val="none" w:sz="0" w:space="0" w:color="auto"/>
           <w:insideH w:val="single" w:sz="2" w:space="0" w:color="D4DAE1"/>
-          <w:insideV w:val="none" w:sz="0" w:space="0" w:color="auto"/>
         </w:tblBorders>
         <w:tblCellMar>
           <w:top w:w="90" w:type="dxa"/>
           <w:left w:w="0" w:type="dxa"/>
           <w:bottom w:w="90" w:type="dxa"/>
-          <w:right w:w="110" w:type="dxa"/>
         </w:tblCellMar>
+        <w:tblLook w:val="04A0" w:firstRow="1" w:lastRow="0" w:firstColumn="1" w:lastColumn="0" w:noHBand="0" w:noVBand="1"/>
       </w:tblPr>
       <w:tblGrid>
-        <w:gridCol w:w="2620"/>
-        <w:gridCol w:w="6740"/>
+        <w:gridCol w:w="2621"/>
+        <w:gridCol w:w="6739"/>
       </w:tblGrid>
       <w:tr>
         <w:trPr>
@@ -60,10 +56,10 @@
               <w:rPr>
                 <w:b/>
                 <w:caps/>
+                <w:color w:val="5B6875"/>
                 <w:sz w:val="15"/>
-                <w:color w:val="5B6875"/>
               </w:rPr>
-              <w:t xml:space="preserve">Document</w:t>
+              <w:t>Document</w:t>
             </w:r>
           </w:p>
         </w:tc>
@@ -77,10 +73,7 @@
               <w:pStyle w:val="TableCell"/>
             </w:pPr>
             <w:r>
-              <w:rPr>
-                <w:sz w:val="18"/>
-              </w:rPr>
-              <w:t xml:space="preserve">Executive Summary</w:t>
+              <w:t>Executive Summary</w:t>
             </w:r>
           </w:p>
         </w:tc>
@@ -102,10 +95,10 @@
               <w:rPr>
                 <w:b/>
                 <w:caps/>
+                <w:color w:val="5B6875"/>
                 <w:sz w:val="15"/>
-                <w:color w:val="5B6875"/>
               </w:rPr>
-              <w:t xml:space="preserve">Package</w:t>
+              <w:t>Package</w:t>
             </w:r>
           </w:p>
         </w:tc>
@@ -119,10 +112,7 @@
               <w:pStyle w:val="TableCell"/>
             </w:pPr>
             <w:r>
-              <w:rPr>
-                <w:sz w:val="18"/>
-              </w:rPr>
-              <w:t xml:space="preserve">Server Reboots</w:t>
+              <w:t>Server Reboots</w:t>
             </w:r>
           </w:p>
         </w:tc>
@@ -144,10 +134,10 @@
               <w:rPr>
                 <w:b/>
                 <w:caps/>
+                <w:color w:val="5B6875"/>
                 <w:sz w:val="15"/>
-                <w:color w:val="5B6875"/>
               </w:rPr>
-              <w:t xml:space="preserve">Platform</w:t>
+              <w:t>Platform</w:t>
             </w:r>
           </w:p>
         </w:tc>
@@ -161,10 +151,7 @@
               <w:pStyle w:val="TableCell"/>
             </w:pPr>
             <w:r>
-              <w:rPr>
-                <w:sz w:val="18"/>
-              </w:rPr>
-              <w:t xml:space="preserve">VCF Automation 9.1.1 / VCF Operations Orchestrator 9</w:t>
+              <w:t>VCF Automation 9.1.1 / VCF Operations Orchestrator 9</w:t>
             </w:r>
           </w:p>
         </w:tc>
@@ -186,10 +173,10 @@
               <w:rPr>
                 <w:b/>
                 <w:caps/>
+                <w:color w:val="5B6875"/>
                 <w:sz w:val="15"/>
-                <w:color w:val="5B6875"/>
               </w:rPr>
-              <w:t xml:space="preserve">Source</w:t>
+              <w:t>Source</w:t>
             </w:r>
           </w:p>
         </w:tc>
@@ -204,12 +191,10 @@
             </w:pPr>
             <w:r>
               <w:rPr>
-                <w:sz w:val="18"/>
                 <w:rFonts w:ascii="Consolas" w:hAnsi="Consolas"/>
-                <w:sz w:val="18"/>
-                <w:shd w:val="clear" w:fill="EEF1F4"/>
+                <w:shd w:val="clear" w:color="auto" w:fill="EEF1F4"/>
               </w:rPr>
-              <w:t xml:space="preserve">01_Executive_Summary.md</w:t>
+              <w:t>01_Executive_Summary.md</w:t>
             </w:r>
           </w:p>
         </w:tc>
@@ -220,86 +205,34 @@
         <w:spacing w:after="0"/>
       </w:pPr>
     </w:p>
-    <w:tbl>
-      <w:tblPr>
-        <w:tblStyle w:val="TableGrid"/>
-        <w:tblW w:w="5000" w:type="pct"/>
-        <w:tblBorders>
-          <w:top w:val="none" w:sz="0" w:space="0" w:color="auto"/>
-          <w:bottom w:val="none" w:sz="0" w:space="0" w:color="auto"/>
-          <w:left w:val="single" w:sz="18" w:space="0" w:color="1F5C8B"/>
-          <w:right w:val="none" w:sz="0" w:space="0" w:color="auto"/>
-          <w:insideH w:val="none" w:sz="0" w:space="0" w:color="auto"/>
-          <w:insideV w:val="none" w:sz="0" w:space="0" w:color="auto"/>
-        </w:tblBorders>
-        <w:tblCellMar>
-          <w:top w:w="120" w:type="dxa"/>
-          <w:left w:w="180" w:type="dxa"/>
-          <w:bottom w:w="120" w:type="dxa"/>
-          <w:right w:w="180" w:type="dxa"/>
-        </w:tblCellMar>
-      </w:tblPr>
-      <w:tr>
-        <w:trPr>
-          <w:cantSplit/>
-        </w:trPr>
-        <w:tc>
-          <w:tcPr>
-            <w:shd w:val="clear" w:fill="EAF0F5"/>
-          </w:tcPr>
-          <w:p>
-            <w:pPr>
-              <w:spacing w:after="40"/>
-            </w:pPr>
-            <w:r>
-              <w:rPr>
-                <w:b/>
-                <w:caps/>
-                <w:color w:val="1F5C8B"/>
-                <w:sz w:val="16"/>
-              </w:rPr>
-              <w:t xml:space="preserve">Generated file</w:t>
-            </w:r>
-          </w:p>
-          <w:p>
-            <w:pPr>
-              <w:spacing w:after="0"/>
-            </w:pPr>
-            <w:r>
-              <w:rPr/>
-              <w:t xml:space="preserve">This document is generated from </w:t>
-            </w:r>
-            <w:r>
-              <w:rPr>
-                <w:b/>
-              </w:rPr>
-              <w:t xml:space="preserve">01_Executive_Summary.md</w:t>
-            </w:r>
-            <w:r>
-              <w:rPr/>
-              <w:t xml:space="preserve">. Edit the Markdown and rebuild - changes made here are lost the next time it is built.</w:t>
-            </w:r>
-          </w:p>
-        </w:tc>
-      </w:tr>
-    </w:tbl>
-    <w:p>
-      <w:pPr>
-        <w:spacing w:after="0"/>
-      </w:pPr>
+    <w:p>
+      <w:r>
+        <w:br w:type="page"/>
+      </w:r>
     </w:p>
     <w:p>
       <w:pPr>
         <w:pStyle w:val="Heading1"/>
       </w:pPr>
-      <w:r>
-        <w:rPr/>
-        <w:t xml:space="preserve">Contents</w:t>
-      </w:r>
-    </w:p>
-    <w:p>
-      <w:r>
-        <w:fldChar w:fldCharType="begin" w:dirty="true"/>
+      <w:bookmarkStart w:id="0" w:name="_Toc241478460"/>
+      <w:r>
+        <w:lastRenderedPageBreak/>
+        <w:t>Contents</w:t>
+      </w:r>
+      <w:bookmarkEnd w:id="0"/>
+    </w:p>
+    <w:p>
+      <w:pPr>
+        <w:pStyle w:val="TOC1"/>
+        <w:tabs>
+          <w:tab w:val="right" w:leader="dot" w:pos="9350"/>
+        </w:tabs>
+        <w:rPr>
+          <w:noProof/>
+        </w:rPr>
+      </w:pPr>
+      <w:r>
+        <w:fldChar w:fldCharType="begin"/>
       </w:r>
       <w:r>
         <w:instrText xml:space="preserve"> TOC \o "1-2" \h \z \u </w:instrText>
@@ -307,14 +240,546 @@
       <w:r>
         <w:fldChar w:fldCharType="separate"/>
       </w:r>
+      <w:hyperlink w:anchor="_Toc241478460" w:history="1">
+        <w:r>
+          <w:rPr>
+            <w:rStyle w:val="Hyperlink"/>
+            <w:noProof/>
+          </w:rPr>
+          <w:t>Contents</w:t>
+        </w:r>
+        <w:r>
+          <w:rPr>
+            <w:noProof/>
+            <w:webHidden/>
+          </w:rPr>
+          <w:tab/>
+        </w:r>
+        <w:r>
+          <w:rPr>
+            <w:noProof/>
+            <w:webHidden/>
+          </w:rPr>
+          <w:fldChar w:fldCharType="begin"/>
+        </w:r>
+        <w:r>
+          <w:rPr>
+            <w:noProof/>
+            <w:webHidden/>
+          </w:rPr>
+          <w:instrText xml:space="preserve"> PAGEREF _Toc241478460 \h </w:instrText>
+        </w:r>
+        <w:r>
+          <w:rPr>
+            <w:noProof/>
+            <w:webHidden/>
+          </w:rPr>
+        </w:r>
+        <w:r>
+          <w:rPr>
+            <w:noProof/>
+            <w:webHidden/>
+          </w:rPr>
+          <w:fldChar w:fldCharType="separate"/>
+        </w:r>
+        <w:r>
+          <w:rPr>
+            <w:noProof/>
+            <w:webHidden/>
+          </w:rPr>
+          <w:t>1</w:t>
+        </w:r>
+        <w:r>
+          <w:rPr>
+            <w:noProof/>
+            <w:webHidden/>
+          </w:rPr>
+          <w:fldChar w:fldCharType="end"/>
+        </w:r>
+      </w:hyperlink>
+    </w:p>
+    <w:p>
+      <w:pPr>
+        <w:pStyle w:val="TOC1"/>
+        <w:tabs>
+          <w:tab w:val="right" w:leader="dot" w:pos="9350"/>
+        </w:tabs>
+        <w:rPr>
+          <w:noProof/>
+        </w:rPr>
+      </w:pPr>
+      <w:hyperlink w:anchor="_Toc241478461" w:history="1">
+        <w:r>
+          <w:rPr>
+            <w:rStyle w:val="Hyperlink"/>
+            <w:noProof/>
+          </w:rPr>
+          <w:t>Business objective</w:t>
+        </w:r>
+        <w:r>
+          <w:rPr>
+            <w:noProof/>
+            <w:webHidden/>
+          </w:rPr>
+          <w:tab/>
+        </w:r>
+        <w:r>
+          <w:rPr>
+            <w:noProof/>
+            <w:webHidden/>
+          </w:rPr>
+          <w:fldChar w:fldCharType="begin"/>
+        </w:r>
+        <w:r>
+          <w:rPr>
+            <w:noProof/>
+            <w:webHidden/>
+          </w:rPr>
+          <w:instrText xml:space="preserve"> PAGEREF _Toc241478461 \h </w:instrText>
+        </w:r>
+        <w:r>
+          <w:rPr>
+            <w:noProof/>
+            <w:webHidden/>
+          </w:rPr>
+        </w:r>
+        <w:r>
+          <w:rPr>
+            <w:noProof/>
+            <w:webHidden/>
+          </w:rPr>
+          <w:fldChar w:fldCharType="separate"/>
+        </w:r>
+        <w:r>
+          <w:rPr>
+            <w:noProof/>
+            <w:webHidden/>
+          </w:rPr>
+          <w:t>2</w:t>
+        </w:r>
+        <w:r>
+          <w:rPr>
+            <w:noProof/>
+            <w:webHidden/>
+          </w:rPr>
+          <w:fldChar w:fldCharType="end"/>
+        </w:r>
+      </w:hyperlink>
+    </w:p>
+    <w:p>
+      <w:pPr>
+        <w:pStyle w:val="TOC1"/>
+        <w:tabs>
+          <w:tab w:val="right" w:leader="dot" w:pos="9350"/>
+        </w:tabs>
+        <w:rPr>
+          <w:noProof/>
+        </w:rPr>
+      </w:pPr>
+      <w:hyperlink w:anchor="_Toc241478462" w:history="1">
+        <w:r>
+          <w:rPr>
+            <w:rStyle w:val="Hyperlink"/>
+            <w:noProof/>
+          </w:rPr>
+          <w:t>Scope</w:t>
+        </w:r>
+        <w:r>
+          <w:rPr>
+            <w:noProof/>
+            <w:webHidden/>
+          </w:rPr>
+          <w:tab/>
+        </w:r>
+        <w:r>
+          <w:rPr>
+            <w:noProof/>
+            <w:webHidden/>
+          </w:rPr>
+          <w:fldChar w:fldCharType="begin"/>
+        </w:r>
+        <w:r>
+          <w:rPr>
+            <w:noProof/>
+            <w:webHidden/>
+          </w:rPr>
+          <w:instrText xml:space="preserve"> PAGEREF _Toc241478462 \h </w:instrText>
+        </w:r>
+        <w:r>
+          <w:rPr>
+            <w:noProof/>
+            <w:webHidden/>
+          </w:rPr>
+        </w:r>
+        <w:r>
+          <w:rPr>
+            <w:noProof/>
+            <w:webHidden/>
+          </w:rPr>
+          <w:fldChar w:fldCharType="separate"/>
+        </w:r>
+        <w:r>
+          <w:rPr>
+            <w:noProof/>
+            <w:webHidden/>
+          </w:rPr>
+          <w:t>2</w:t>
+        </w:r>
+        <w:r>
+          <w:rPr>
+            <w:noProof/>
+            <w:webHidden/>
+          </w:rPr>
+          <w:fldChar w:fldCharType="end"/>
+        </w:r>
+      </w:hyperlink>
+    </w:p>
+    <w:p>
+      <w:pPr>
+        <w:pStyle w:val="TOC1"/>
+        <w:tabs>
+          <w:tab w:val="right" w:leader="dot" w:pos="9350"/>
+        </w:tabs>
+        <w:rPr>
+          <w:noProof/>
+        </w:rPr>
+      </w:pPr>
+      <w:hyperlink w:anchor="_Toc241478463" w:history="1">
+        <w:r>
+          <w:rPr>
+            <w:rStyle w:val="Hyperlink"/>
+            <w:noProof/>
+          </w:rPr>
+          <w:t>What makes a server get rebooted (at a glance)</w:t>
+        </w:r>
+        <w:r>
+          <w:rPr>
+            <w:noProof/>
+            <w:webHidden/>
+          </w:rPr>
+          <w:tab/>
+        </w:r>
+        <w:r>
+          <w:rPr>
+            <w:noProof/>
+            <w:webHidden/>
+          </w:rPr>
+          <w:fldChar w:fldCharType="begin"/>
+        </w:r>
+        <w:r>
+          <w:rPr>
+            <w:noProof/>
+            <w:webHidden/>
+          </w:rPr>
+          <w:instrText xml:space="preserve"> PAGEREF _Toc241478463 \h </w:instrText>
+        </w:r>
+        <w:r>
+          <w:rPr>
+            <w:noProof/>
+            <w:webHidden/>
+          </w:rPr>
+        </w:r>
+        <w:r>
+          <w:rPr>
+            <w:noProof/>
+            <w:webHidden/>
+          </w:rPr>
+          <w:fldChar w:fldCharType="separate"/>
+        </w:r>
+        <w:r>
+          <w:rPr>
+            <w:noProof/>
+            <w:webHidden/>
+          </w:rPr>
+          <w:t>2</w:t>
+        </w:r>
+        <w:r>
+          <w:rPr>
+            <w:noProof/>
+            <w:webHidden/>
+          </w:rPr>
+          <w:fldChar w:fldCharType="end"/>
+        </w:r>
+      </w:hyperlink>
+    </w:p>
+    <w:p>
+      <w:pPr>
+        <w:pStyle w:val="TOC1"/>
+        <w:tabs>
+          <w:tab w:val="right" w:leader="dot" w:pos="9350"/>
+        </w:tabs>
+        <w:rPr>
+          <w:noProof/>
+        </w:rPr>
+      </w:pPr>
+      <w:hyperlink w:anchor="_Toc241478464" w:history="1">
+        <w:r>
+          <w:rPr>
+            <w:rStyle w:val="Hyperlink"/>
+            <w:noProof/>
+          </w:rPr>
+          <w:t>Key improvements over the Ansible automation</w:t>
+        </w:r>
+        <w:r>
+          <w:rPr>
+            <w:noProof/>
+            <w:webHidden/>
+          </w:rPr>
+          <w:tab/>
+        </w:r>
+        <w:r>
+          <w:rPr>
+            <w:noProof/>
+            <w:webHidden/>
+          </w:rPr>
+          <w:fldChar w:fldCharType="begin"/>
+        </w:r>
+        <w:r>
+          <w:rPr>
+            <w:noProof/>
+            <w:webHidden/>
+          </w:rPr>
+          <w:instrText xml:space="preserve"> PAGEREF _Toc241478464 \h </w:instrText>
+        </w:r>
+        <w:r>
+          <w:rPr>
+            <w:noProof/>
+            <w:webHidden/>
+          </w:rPr>
+        </w:r>
+        <w:r>
+          <w:rPr>
+            <w:noProof/>
+            <w:webHidden/>
+          </w:rPr>
+          <w:fldChar w:fldCharType="separate"/>
+        </w:r>
+        <w:r>
+          <w:rPr>
+            <w:noProof/>
+            <w:webHidden/>
+          </w:rPr>
+          <w:t>2</w:t>
+        </w:r>
+        <w:r>
+          <w:rPr>
+            <w:noProof/>
+            <w:webHidden/>
+          </w:rPr>
+          <w:fldChar w:fldCharType="end"/>
+        </w:r>
+      </w:hyperlink>
+    </w:p>
+    <w:p>
+      <w:pPr>
+        <w:pStyle w:val="TOC1"/>
+        <w:tabs>
+          <w:tab w:val="right" w:leader="dot" w:pos="9350"/>
+        </w:tabs>
+        <w:rPr>
+          <w:noProof/>
+        </w:rPr>
+      </w:pPr>
+      <w:hyperlink w:anchor="_Toc241478465" w:history="1">
+        <w:r>
+          <w:rPr>
+            <w:rStyle w:val="Hyperlink"/>
+            <w:noProof/>
+          </w:rPr>
+          <w:t>Benefits</w:t>
+        </w:r>
+        <w:r>
+          <w:rPr>
+            <w:noProof/>
+            <w:webHidden/>
+          </w:rPr>
+          <w:tab/>
+        </w:r>
+        <w:r>
+          <w:rPr>
+            <w:noProof/>
+            <w:webHidden/>
+          </w:rPr>
+          <w:fldChar w:fldCharType="begin"/>
+        </w:r>
+        <w:r>
+          <w:rPr>
+            <w:noProof/>
+            <w:webHidden/>
+          </w:rPr>
+          <w:instrText xml:space="preserve"> PAGEREF _Toc241478465 \h </w:instrText>
+        </w:r>
+        <w:r>
+          <w:rPr>
+            <w:noProof/>
+            <w:webHidden/>
+          </w:rPr>
+        </w:r>
+        <w:r>
+          <w:rPr>
+            <w:noProof/>
+            <w:webHidden/>
+          </w:rPr>
+          <w:fldChar w:fldCharType="separate"/>
+        </w:r>
+        <w:r>
+          <w:rPr>
+            <w:noProof/>
+            <w:webHidden/>
+          </w:rPr>
+          <w:t>3</w:t>
+        </w:r>
+        <w:r>
+          <w:rPr>
+            <w:noProof/>
+            <w:webHidden/>
+          </w:rPr>
+          <w:fldChar w:fldCharType="end"/>
+        </w:r>
+      </w:hyperlink>
+    </w:p>
+    <w:p>
+      <w:pPr>
+        <w:pStyle w:val="TOC1"/>
+        <w:tabs>
+          <w:tab w:val="right" w:leader="dot" w:pos="9350"/>
+        </w:tabs>
+        <w:rPr>
+          <w:noProof/>
+        </w:rPr>
+      </w:pPr>
+      <w:hyperlink w:anchor="_Toc241478466" w:history="1">
+        <w:r>
+          <w:rPr>
+            <w:rStyle w:val="Hyperlink"/>
+            <w:noProof/>
+          </w:rPr>
+          <w:t>Key risks / decisions</w:t>
+        </w:r>
+        <w:r>
+          <w:rPr>
+            <w:noProof/>
+            <w:webHidden/>
+          </w:rPr>
+          <w:tab/>
+        </w:r>
+        <w:r>
+          <w:rPr>
+            <w:noProof/>
+            <w:webHidden/>
+          </w:rPr>
+          <w:fldChar w:fldCharType="begin"/>
+        </w:r>
+        <w:r>
+          <w:rPr>
+            <w:noProof/>
+            <w:webHidden/>
+          </w:rPr>
+          <w:instrText xml:space="preserve"> PAGEREF _Toc241478466 \h </w:instrText>
+        </w:r>
+        <w:r>
+          <w:rPr>
+            <w:noProof/>
+            <w:webHidden/>
+          </w:rPr>
+        </w:r>
+        <w:r>
+          <w:rPr>
+            <w:noProof/>
+            <w:webHidden/>
+          </w:rPr>
+          <w:fldChar w:fldCharType="separate"/>
+        </w:r>
+        <w:r>
+          <w:rPr>
+            <w:noProof/>
+            <w:webHidden/>
+          </w:rPr>
+          <w:t>3</w:t>
+        </w:r>
+        <w:r>
+          <w:rPr>
+            <w:noProof/>
+            <w:webHidden/>
+          </w:rPr>
+          <w:fldChar w:fldCharType="end"/>
+        </w:r>
+      </w:hyperlink>
+    </w:p>
+    <w:p>
+      <w:pPr>
+        <w:pStyle w:val="TOC1"/>
+        <w:tabs>
+          <w:tab w:val="right" w:leader="dot" w:pos="9350"/>
+        </w:tabs>
+        <w:rPr>
+          <w:noProof/>
+        </w:rPr>
+      </w:pPr>
+      <w:hyperlink w:anchor="_Toc241478467" w:history="1">
+        <w:r>
+          <w:rPr>
+            <w:rStyle w:val="Hyperlink"/>
+            <w:noProof/>
+          </w:rPr>
+          <w:t>Status</w:t>
+        </w:r>
+        <w:r>
+          <w:rPr>
+            <w:noProof/>
+            <w:webHidden/>
+          </w:rPr>
+          <w:tab/>
+        </w:r>
+        <w:r>
+          <w:rPr>
+            <w:noProof/>
+            <w:webHidden/>
+          </w:rPr>
+          <w:fldChar w:fldCharType="begin"/>
+        </w:r>
+        <w:r>
+          <w:rPr>
+            <w:noProof/>
+            <w:webHidden/>
+          </w:rPr>
+          <w:instrText xml:space="preserve"> PAGEREF _Toc241478467 \h </w:instrText>
+        </w:r>
+        <w:r>
+          <w:rPr>
+            <w:noProof/>
+            <w:webHidden/>
+          </w:rPr>
+        </w:r>
+        <w:r>
+          <w:rPr>
+            <w:noProof/>
+            <w:webHidden/>
+          </w:rPr>
+          <w:fldChar w:fldCharType="separate"/>
+        </w:r>
+        <w:r>
+          <w:rPr>
+            <w:noProof/>
+            <w:webHidden/>
+          </w:rPr>
+          <w:t>4</w:t>
+        </w:r>
+        <w:r>
+          <w:rPr>
+            <w:noProof/>
+            <w:webHidden/>
+          </w:rPr>
+          <w:fldChar w:fldCharType="end"/>
+        </w:r>
+      </w:hyperlink>
+    </w:p>
+    <w:p>
       <w:r>
         <w:rPr>
           <w:i/>
           <w:color w:val="5B6875"/>
         </w:rPr>
-        <w:t xml:space="preserve">Right-click here and choose Update Field to build the contents.</w:t>
-      </w:r>
-      <w:r>
         <w:fldChar w:fldCharType="end"/>
       </w:r>
     </w:p>
@@ -327,62 +792,61 @@
       <w:pPr>
         <w:pStyle w:val="Heading1"/>
       </w:pPr>
-      <w:r>
-        <w:rPr/>
-        <w:t xml:space="preserve">Business objective</w:t>
-      </w:r>
+      <w:bookmarkStart w:id="1" w:name="_Toc241478461"/>
+      <w:r>
+        <w:lastRenderedPageBreak/>
+        <w:t>Business objective</w:t>
+      </w:r>
+      <w:bookmarkEnd w:id="1"/>
     </w:p>
     <w:p>
       <w:pPr>
         <w:pStyle w:val="BodyText"/>
       </w:pPr>
       <w:r>
-        <w:rPr/>
         <w:t xml:space="preserve">Replace the Ansible </w:t>
       </w:r>
+      <w:proofErr w:type="spellStart"/>
       <w:r>
         <w:rPr>
           <w:rFonts w:ascii="Consolas" w:hAnsi="Consolas"/>
           <w:sz w:val="18"/>
-          <w:shd w:val="clear" w:fill="EEF1F4"/>
-        </w:rPr>
-        <w:t xml:space="preserve">servers_reboot.yml</w:t>
-      </w:r>
-      <w:r>
-        <w:rPr/>
+          <w:shd w:val="clear" w:color="auto" w:fill="EEF1F4"/>
+        </w:rPr>
+        <w:t>servers_reboot.yml</w:t>
+      </w:r>
+      <w:proofErr w:type="spellEnd"/>
+      <w:r>
         <w:t xml:space="preserve"> playbook with a VCF Orchestrator workflow, </w:t>
       </w:r>
       <w:r>
         <w:rPr>
+          <w:rFonts w:ascii="Consolas" w:hAnsi="Consolas"/>
           <w:b/>
-          <w:rFonts w:ascii="Consolas" w:hAnsi="Consolas"/>
           <w:sz w:val="18"/>
-          <w:shd w:val="clear" w:fill="EEF1F4"/>
-        </w:rPr>
-        <w:t xml:space="preserve">Reboot Servers in AD Group</w:t>
-      </w:r>
-      <w:r>
-        <w:rPr/>
+          <w:shd w:val="clear" w:color="auto" w:fill="EEF1F4"/>
+        </w:rPr>
+        <w:t>Reboot Servers in AD Group</w:t>
+      </w:r>
+      <w:r>
         <w:t xml:space="preserve">, that reboots Windows servers </w:t>
       </w:r>
       <w:r>
         <w:rPr>
           <w:b/>
         </w:rPr>
-        <w:t xml:space="preserve">which are reporting a pending reboot</w:t>
-      </w:r>
-      <w:r>
-        <w:rPr/>
+        <w:t>which are reporting a pending reboot</w:t>
+      </w:r>
+      <w:r>
         <w:t xml:space="preserve"> — the direct members of a designated Active Directory group — one at a time, on a schedule, and produces an auditable per-server report. The automation supports </w:t>
       </w:r>
       <w:r>
         <w:rPr>
           <w:b/>
         </w:rPr>
-        <w:t xml:space="preserve">both physical and virtual servers</w:t>
-      </w:r>
-      <w:r>
-        <w:rPr/>
+        <w:t>both physical and virtual servers</w:t>
+      </w:r>
+      <w:r>
         <w:t xml:space="preserve"> because every operation is OS-level (no hypervisor dependency).</w:t>
       </w:r>
     </w:p>
@@ -390,10 +854,11 @@
       <w:pPr>
         <w:pStyle w:val="Heading1"/>
       </w:pPr>
-      <w:r>
-        <w:rPr/>
-        <w:t xml:space="preserve">Scope</w:t>
-      </w:r>
+      <w:bookmarkStart w:id="2" w:name="_Toc241478462"/>
+      <w:r>
+        <w:t>Scope</w:t>
+      </w:r>
+      <w:bookmarkEnd w:id="2"/>
     </w:p>
     <w:p>
       <w:pPr>
@@ -404,8 +869,7 @@
         </w:numPr>
       </w:pPr>
       <w:r>
-        <w:rPr/>
-        <w:t xml:space="preserve">One workflow that resolves an AD group, checks each member's pending-reboot state, reboots only those that need it, confirms each one returns to service, and reports the outcome per server — in the run log every time, and by email when requested.</w:t>
+        <w:t>One workflow that resolves an AD group, checks each member's pending-reboot state, reboots only those that need it, confirms each one returns to service, and reports the outcome per server — in the run log every time, and by email when requested.</w:t>
       </w:r>
     </w:p>
     <w:p>
@@ -420,33 +884,30 @@
         <w:rPr>
           <w:b/>
         </w:rPr>
-        <w:t xml:space="preserve">Orchestrator works out which servers to process</w:t>
-      </w:r>
-      <w:r>
-        <w:rPr/>
+        <w:t>Orchestrator works out which servers to process</w:t>
+      </w:r>
+      <w:r>
         <w:t xml:space="preserve"> using its Active Directory plug-in. </w:t>
       </w:r>
       <w:r>
         <w:rPr>
           <w:b/>
         </w:rPr>
-        <w:t xml:space="preserve">A purpose-built PowerShell script</w:t>
-      </w:r>
-      <w:r>
-        <w:rPr/>
+        <w:t>A purpose-built PowerShell script</w:t>
+      </w:r>
+      <w:r>
         <w:t xml:space="preserve"> (</w:t>
       </w:r>
       <w:r>
         <w:rPr>
           <w:rFonts w:ascii="Consolas" w:hAnsi="Consolas"/>
           <w:sz w:val="18"/>
-          <w:shd w:val="clear" w:fill="EEF1F4"/>
-        </w:rPr>
-        <w:t xml:space="preserve">Invoke-ServerReboot.ps1</w:t>
-      </w:r>
-      <w:r>
-        <w:rPr/>
-        <w:t xml:space="preserve">), held in Orchestrator and copied to the PowerShell host only for the duration of each run, does the checking, rebooting and verification.</w:t>
+          <w:shd w:val="clear" w:color="auto" w:fill="EEF1F4"/>
+        </w:rPr>
+        <w:t>Invoke-ServerReboot.ps1</w:t>
+      </w:r>
+      <w:r>
+        <w:t>), held in Orchestrator and copied to the PowerShell host only for the duration of each run, does the checking, rebooting and verification.</w:t>
       </w:r>
     </w:p>
     <w:p>
@@ -458,18 +919,16 @@
         </w:numPr>
       </w:pPr>
       <w:r>
-        <w:rPr/>
         <w:t xml:space="preserve">Intended to run </w:t>
       </w:r>
       <w:r>
         <w:rPr>
           <w:b/>
         </w:rPr>
-        <w:t xml:space="preserve">on a schedule that always attempts reboots</w:t>
-      </w:r>
-      <w:r>
-        <w:rPr/>
-        <w:t xml:space="preserve">. A Report Only mode is available for dry runs.</w:t>
+        <w:t>on a schedule that always attempts reboots</w:t>
+      </w:r>
+      <w:r>
+        <w:t>. A Report Only mode is available for dry runs.</w:t>
       </w:r>
     </w:p>
     <w:p>
@@ -482,36 +941,47 @@
         <w:pStyle w:val="BodyText"/>
       </w:pPr>
       <w:r>
-        <w:rPr/>
-        <w:t xml:space="preserve">Out of scope: patch installation, rebooting servers not directly in the target group, and rebooting servers the PowerShell host cannot reach over RPC/WMI.</w:t>
+        <w:t>Out of scope: patch installation, rebooting servers not directly in the target group, and rebooting servers the PowerShell host cannot reach over RPC/WMI.</w:t>
       </w:r>
     </w:p>
     <w:p>
       <w:pPr>
         <w:pStyle w:val="Heading1"/>
       </w:pPr>
-      <w:r>
-        <w:rPr/>
-        <w:t xml:space="preserve">What makes a server get rebooted (at a glance)</w:t>
-      </w:r>
+      <w:bookmarkStart w:id="3" w:name="_Toc241478463"/>
+      <w:r>
+        <w:t>What makes a server get rebooted (</w:t>
+      </w:r>
+      <w:proofErr w:type="gramStart"/>
+      <w:r>
+        <w:t>at a glance</w:t>
+      </w:r>
+      <w:proofErr w:type="gramEnd"/>
+      <w:r>
+        <w:t>)</w:t>
+      </w:r>
+      <w:bookmarkEnd w:id="3"/>
     </w:p>
     <w:p>
       <w:pPr>
         <w:pStyle w:val="BodyText"/>
       </w:pPr>
       <w:r>
-        <w:rPr/>
         <w:t xml:space="preserve">A server is rebooted only when </w:t>
       </w:r>
+      <w:proofErr w:type="gramStart"/>
       <w:r>
         <w:rPr>
           <w:b/>
         </w:rPr>
-        <w:t xml:space="preserve">all</w:t>
-      </w:r>
-      <w:r>
-        <w:rPr/>
-        <w:t xml:space="preserve"> of the following are true:</w:t>
+        <w:t>all</w:t>
+      </w:r>
+      <w:r>
+        <w:t xml:space="preserve"> of</w:t>
+      </w:r>
+      <w:proofErr w:type="gramEnd"/>
+      <w:r>
+        <w:t xml:space="preserve"> the following are true:</w:t>
       </w:r>
     </w:p>
     <w:p>
@@ -523,17 +993,15 @@
         </w:numPr>
       </w:pPr>
       <w:r>
-        <w:rPr/>
         <w:t xml:space="preserve">It is a </w:t>
       </w:r>
       <w:r>
         <w:rPr>
           <w:b/>
         </w:rPr>
-        <w:t xml:space="preserve">direct, enabled computer member</w:t>
-      </w:r>
-      <w:r>
-        <w:rPr/>
+        <w:t>direct, enabled computer member</w:t>
+      </w:r>
+      <w:r>
         <w:t xml:space="preserve"> of the target AD group. Nested groups and disabled accounts are excluded, and any nested group is named in the run log.</w:t>
       </w:r>
     </w:p>
@@ -546,18 +1014,24 @@
         </w:numPr>
       </w:pPr>
       <w:r>
-        <w:rPr/>
         <w:t xml:space="preserve">It reports a </w:t>
       </w:r>
       <w:r>
         <w:rPr>
           <w:b/>
         </w:rPr>
-        <w:t xml:space="preserve">pending reboot</w:t>
-      </w:r>
-      <w:r>
-        <w:rPr/>
-        <w:t xml:space="preserve"> — detected via Windows Component Based Servicing, Windows Update, or the SCCM/ConfigMgr client.</w:t>
+        <w:t>pending reboot</w:t>
+      </w:r>
+      <w:r>
+        <w:t xml:space="preserve"> — detected via Windows Component Based Servicing, Windows Update, or the SCCM/</w:t>
+      </w:r>
+      <w:proofErr w:type="spellStart"/>
+      <w:r>
+        <w:t>ConfigMgr</w:t>
+      </w:r>
+      <w:proofErr w:type="spellEnd"/>
+      <w:r>
+        <w:t xml:space="preserve"> client.</w:t>
       </w:r>
     </w:p>
     <w:p>
@@ -569,17 +1043,15 @@
         </w:numPr>
       </w:pPr>
       <w:r>
-        <w:rPr/>
         <w:t xml:space="preserve">The run is in </w:t>
       </w:r>
       <w:r>
         <w:rPr>
           <w:b/>
         </w:rPr>
-        <w:t xml:space="preserve">Reboot</w:t>
-      </w:r>
-      <w:r>
-        <w:rPr/>
+        <w:t>Reboot</w:t>
+      </w:r>
+      <w:r>
         <w:t xml:space="preserve"> mode — which the schedule always sets.</w:t>
       </w:r>
     </w:p>
@@ -593,62 +1065,54 @@
         <w:pStyle w:val="BodyText"/>
       </w:pPr>
       <w:r>
-        <w:rPr/>
         <w:t xml:space="preserve">Servers whose pending state cannot be read are </w:t>
       </w:r>
       <w:r>
         <w:rPr>
           <w:b/>
         </w:rPr>
-        <w:t xml:space="preserve">skipped, never rebooted</w:t>
-      </w:r>
-      <w:r>
-        <w:rPr/>
-        <w:t xml:space="preserve">.</w:t>
+        <w:t>skipped, never rebooted</w:t>
+      </w:r>
+      <w:r>
+        <w:t>.</w:t>
       </w:r>
     </w:p>
     <w:p>
       <w:pPr>
         <w:pStyle w:val="Heading1"/>
       </w:pPr>
-      <w:r>
-        <w:rPr/>
-        <w:t xml:space="preserve">Key improvements over the Ansible automation</w:t>
-      </w:r>
+      <w:bookmarkStart w:id="4" w:name="_Toc241478464"/>
+      <w:r>
+        <w:t>Key improvements over the Ansible automation</w:t>
+      </w:r>
+      <w:bookmarkEnd w:id="4"/>
     </w:p>
     <w:tbl>
       <w:tblPr>
         <w:tblStyle w:val="TableGrid"/>
         <w:tblW w:w="5000" w:type="pct"/>
+        <w:tblInd w:w="0" w:type="dxa"/>
         <w:tblBorders>
           <w:top w:val="single" w:sz="4" w:space="0" w:color="B2BDC7"/>
           <w:bottom w:val="single" w:sz="4" w:space="0" w:color="B2BDC7"/>
-          <w:left w:val="none" w:sz="0" w:space="0" w:color="auto"/>
-          <w:right w:val="none" w:sz="0" w:space="0" w:color="auto"/>
           <w:insideH w:val="single" w:sz="2" w:space="0" w:color="D4DAE1"/>
-          <w:insideV w:val="none" w:sz="0" w:space="0" w:color="auto"/>
         </w:tblBorders>
-        <w:tblCellMar>
-          <w:top w:w="80" w:type="dxa"/>
-          <w:left w:w="110" w:type="dxa"/>
-          <w:bottom w:w="80" w:type="dxa"/>
-          <w:right w:w="110" w:type="dxa"/>
-        </w:tblCellMar>
+        <w:tblLook w:val="04A0" w:firstRow="1" w:lastRow="0" w:firstColumn="1" w:lastColumn="0" w:noHBand="0" w:noVBand="1"/>
       </w:tblPr>
       <w:tblGrid>
         <w:gridCol w:w="1966"/>
         <w:gridCol w:w="3370"/>
-        <w:gridCol w:w="4025"/>
+        <w:gridCol w:w="4024"/>
       </w:tblGrid>
       <w:tr>
         <w:trPr>
+          <w:cantSplit/>
           <w:tblHeader/>
-          <w:cantSplit/>
         </w:trPr>
         <w:tc>
           <w:tcPr>
             <w:tcW w:w="1966" w:type="dxa"/>
-            <w:shd w:val="clear" w:fill="1F5C8B"/>
+            <w:shd w:val="clear" w:color="auto" w:fill="1F5C8B"/>
             <w:vAlign w:val="center"/>
           </w:tcPr>
           <w:p>
@@ -661,14 +1125,14 @@
                 <w:color w:val="FFFFFF"/>
                 <w:sz w:val="17"/>
               </w:rPr>
-              <w:t xml:space="preserve">Area</w:t>
+              <w:t>Area</w:t>
             </w:r>
           </w:p>
         </w:tc>
         <w:tc>
           <w:tcPr>
             <w:tcW w:w="3370" w:type="dxa"/>
-            <w:shd w:val="clear" w:fill="1F5C8B"/>
+            <w:shd w:val="clear" w:color="auto" w:fill="1F5C8B"/>
             <w:vAlign w:val="center"/>
           </w:tcPr>
           <w:p>
@@ -681,14 +1145,14 @@
                 <w:color w:val="FFFFFF"/>
                 <w:sz w:val="17"/>
               </w:rPr>
-              <w:t xml:space="preserve">Ansible (before)</w:t>
+              <w:t>Ansible (before)</w:t>
             </w:r>
           </w:p>
         </w:tc>
         <w:tc>
           <w:tcPr>
             <w:tcW w:w="4025" w:type="dxa"/>
-            <w:shd w:val="clear" w:fill="1F5C8B"/>
+            <w:shd w:val="clear" w:color="auto" w:fill="1F5C8B"/>
             <w:vAlign w:val="center"/>
           </w:tcPr>
           <w:p>
@@ -701,7 +1165,7 @@
                 <w:color w:val="FFFFFF"/>
                 <w:sz w:val="17"/>
               </w:rPr>
-              <w:t xml:space="preserve">Orchestrator (now)</w:t>
+              <w:t>Orchestrator (now)</w:t>
             </w:r>
           </w:p>
         </w:tc>
@@ -721,10 +1185,9 @@
             </w:pPr>
             <w:r>
               <w:rPr>
-                <w:sz w:val="18"/>
                 <w:b/>
               </w:rPr>
-              <w:t xml:space="preserve">Reboot confirmation</w:t>
+              <w:t>Reboot confirmation</w:t>
             </w:r>
           </w:p>
         </w:tc>
@@ -738,10 +1201,7 @@
               <w:pStyle w:val="TableCell"/>
             </w:pPr>
             <w:r>
-              <w:rPr>
-                <w:sz w:val="18"/>
-              </w:rPr>
-              <w:t xml:space="preserve">None — fire-and-forget</w:t>
+              <w:t>None — fire-and-forget</w:t>
             </w:r>
           </w:p>
         </w:tc>
@@ -755,10 +1215,7 @@
               <w:pStyle w:val="TableCell"/>
             </w:pPr>
             <w:r>
-              <w:rPr>
-                <w:sz w:val="18"/>
-              </w:rPr>
-              <w:t xml:space="preserve">Each server verified back online (its boot time must advance) within 10 minutes, else reported</w:t>
+              <w:t>Each server verified back online (its boot time must advance) within 10 minutes, else reported</w:t>
             </w:r>
           </w:p>
         </w:tc>
@@ -770,7 +1227,7 @@
         <w:tc>
           <w:tcPr>
             <w:tcW w:w="1966" w:type="dxa"/>
-            <w:shd w:val="clear" w:fill="F2F4F6"/>
+            <w:shd w:val="clear" w:color="auto" w:fill="F2F4F6"/>
             <w:vAlign w:val="center"/>
           </w:tcPr>
           <w:p>
@@ -779,46 +1236,40 @@
             </w:pPr>
             <w:r>
               <w:rPr>
-                <w:sz w:val="18"/>
                 <w:b/>
               </w:rPr>
-              <w:t xml:space="preserve">Reporting</w:t>
+              <w:lastRenderedPageBreak/>
+              <w:t>Reporting</w:t>
             </w:r>
           </w:p>
         </w:tc>
         <w:tc>
           <w:tcPr>
             <w:tcW w:w="3370" w:type="dxa"/>
-            <w:shd w:val="clear" w:fill="F2F4F6"/>
-            <w:vAlign w:val="center"/>
-          </w:tcPr>
-          <w:p>
-            <w:pPr>
-              <w:pStyle w:val="TableCell"/>
-            </w:pPr>
-            <w:r>
-              <w:rPr>
-                <w:sz w:val="18"/>
-              </w:rPr>
-              <w:t xml:space="preserve">No report or email</w:t>
+            <w:shd w:val="clear" w:color="auto" w:fill="F2F4F6"/>
+            <w:vAlign w:val="center"/>
+          </w:tcPr>
+          <w:p>
+            <w:pPr>
+              <w:pStyle w:val="TableCell"/>
+            </w:pPr>
+            <w:r>
+              <w:t>No report or email</w:t>
             </w:r>
           </w:p>
         </w:tc>
         <w:tc>
           <w:tcPr>
             <w:tcW w:w="4025" w:type="dxa"/>
-            <w:shd w:val="clear" w:fill="F2F4F6"/>
-            <w:vAlign w:val="center"/>
-          </w:tcPr>
-          <w:p>
-            <w:pPr>
-              <w:pStyle w:val="TableCell"/>
-            </w:pPr>
-            <w:r>
-              <w:rPr>
-                <w:sz w:val="18"/>
-              </w:rPr>
-              <w:t xml:space="preserve">Per-server outcome in every run log; HTML report emailed on request; counts returned to the caller</w:t>
+            <w:shd w:val="clear" w:color="auto" w:fill="F2F4F6"/>
+            <w:vAlign w:val="center"/>
+          </w:tcPr>
+          <w:p>
+            <w:pPr>
+              <w:pStyle w:val="TableCell"/>
+            </w:pPr>
+            <w:r>
+              <w:t>Per-server outcome in every run log; HTML report emailed on request; counts returned to the caller</w:t>
             </w:r>
           </w:p>
         </w:tc>
@@ -838,10 +1289,9 @@
             </w:pPr>
             <w:r>
               <w:rPr>
-                <w:sz w:val="18"/>
                 <w:b/>
               </w:rPr>
-              <w:t xml:space="preserve">Unreachable servers</w:t>
+              <w:t>Unreachable servers</w:t>
             </w:r>
           </w:p>
         </w:tc>
@@ -856,39 +1306,31 @@
             </w:pPr>
             <w:r>
               <w:rPr>
-                <w:sz w:val="18"/>
                 <w:b/>
               </w:rPr>
-              <w:t xml:space="preserve">Force-rebooted</w:t>
-            </w:r>
+              <w:t>Force-rebooted</w:t>
+            </w:r>
+            <w:r>
+              <w:t xml:space="preserve"> even when their state couldn't be read</w:t>
+            </w:r>
+          </w:p>
+        </w:tc>
+        <w:tc>
+          <w:tcPr>
+            <w:tcW w:w="4025" w:type="dxa"/>
+            <w:vAlign w:val="center"/>
+          </w:tcPr>
+          <w:p>
+            <w:pPr>
+              <w:pStyle w:val="TableCell"/>
+            </w:pPr>
             <w:r>
               <w:rPr>
-                <w:sz w:val="18"/>
-              </w:rPr>
-              <w:t xml:space="preserve"> even when their state couldn't be read</w:t>
-            </w:r>
-          </w:p>
-        </w:tc>
-        <w:tc>
-          <w:tcPr>
-            <w:tcW w:w="4025" w:type="dxa"/>
-            <w:vAlign w:val="center"/>
-          </w:tcPr>
-          <w:p>
-            <w:pPr>
-              <w:pStyle w:val="TableCell"/>
-            </w:pPr>
-            <w:r>
-              <w:rPr>
-                <w:sz w:val="18"/>
                 <w:b/>
               </w:rPr>
-              <w:t xml:space="preserve">Skipped and reported</w:t>
-            </w:r>
-            <w:r>
-              <w:rPr>
-                <w:sz w:val="18"/>
-              </w:rPr>
+              <w:t>Skipped and reported</w:t>
+            </w:r>
+            <w:r>
               <w:t xml:space="preserve"> — never rebooted blind</w:t>
             </w:r>
           </w:p>
@@ -901,7 +1343,7 @@
         <w:tc>
           <w:tcPr>
             <w:tcW w:w="1966" w:type="dxa"/>
-            <w:shd w:val="clear" w:fill="F2F4F6"/>
+            <w:shd w:val="clear" w:color="auto" w:fill="F2F4F6"/>
             <w:vAlign w:val="center"/>
           </w:tcPr>
           <w:p>
@@ -910,46 +1352,39 @@
             </w:pPr>
             <w:r>
               <w:rPr>
-                <w:sz w:val="18"/>
                 <w:b/>
               </w:rPr>
-              <w:t xml:space="preserve">Failed reboots</w:t>
+              <w:t>Failed reboots</w:t>
             </w:r>
           </w:p>
         </w:tc>
         <w:tc>
           <w:tcPr>
             <w:tcW w:w="3370" w:type="dxa"/>
-            <w:shd w:val="clear" w:fill="F2F4F6"/>
-            <w:vAlign w:val="center"/>
-          </w:tcPr>
-          <w:p>
-            <w:pPr>
-              <w:pStyle w:val="TableCell"/>
-            </w:pPr>
-            <w:r>
-              <w:rPr>
-                <w:sz w:val="18"/>
-              </w:rPr>
-              <w:t xml:space="preserve">Silently looked successful</w:t>
+            <w:shd w:val="clear" w:color="auto" w:fill="F2F4F6"/>
+            <w:vAlign w:val="center"/>
+          </w:tcPr>
+          <w:p>
+            <w:pPr>
+              <w:pStyle w:val="TableCell"/>
+            </w:pPr>
+            <w:r>
+              <w:t>Silently looked successful</w:t>
             </w:r>
           </w:p>
         </w:tc>
         <w:tc>
           <w:tcPr>
             <w:tcW w:w="4025" w:type="dxa"/>
-            <w:shd w:val="clear" w:fill="F2F4F6"/>
-            <w:vAlign w:val="center"/>
-          </w:tcPr>
-          <w:p>
-            <w:pPr>
-              <w:pStyle w:val="TableCell"/>
-            </w:pPr>
-            <w:r>
-              <w:rPr>
-                <w:sz w:val="18"/>
-              </w:rPr>
-              <w:t xml:space="preserve">Detected and reported</w:t>
+            <w:shd w:val="clear" w:color="auto" w:fill="F2F4F6"/>
+            <w:vAlign w:val="center"/>
+          </w:tcPr>
+          <w:p>
+            <w:pPr>
+              <w:pStyle w:val="TableCell"/>
+            </w:pPr>
+            <w:r>
+              <w:t>Detected and reported</w:t>
             </w:r>
           </w:p>
         </w:tc>
@@ -969,10 +1404,9 @@
             </w:pPr>
             <w:r>
               <w:rPr>
-                <w:sz w:val="18"/>
                 <w:b/>
               </w:rPr>
-              <w:t xml:space="preserve">Targeting</w:t>
+              <w:t>Targeting</w:t>
             </w:r>
           </w:p>
         </w:tc>
@@ -986,10 +1420,7 @@
               <w:pStyle w:val="TableCell"/>
             </w:pPr>
             <w:r>
-              <w:rPr>
-                <w:sz w:val="18"/>
-              </w:rPr>
-              <w:t xml:space="preserve">Unfiltered group membership</w:t>
+              <w:t>Unfiltered group membership</w:t>
             </w:r>
           </w:p>
         </w:tc>
@@ -1003,10 +1434,7 @@
               <w:pStyle w:val="TableCell"/>
             </w:pPr>
             <w:r>
-              <w:rPr>
-                <w:sz w:val="18"/>
-              </w:rPr>
-              <w:t xml:space="preserve">Direct, enabled computer accounts only</w:t>
+              <w:t>Direct, enabled computer accounts only</w:t>
             </w:r>
           </w:p>
         </w:tc>
@@ -1018,7 +1446,7 @@
         <w:tc>
           <w:tcPr>
             <w:tcW w:w="1966" w:type="dxa"/>
-            <w:shd w:val="clear" w:fill="F2F4F6"/>
+            <w:shd w:val="clear" w:color="auto" w:fill="F2F4F6"/>
             <w:vAlign w:val="center"/>
           </w:tcPr>
           <w:p>
@@ -1027,59 +1455,48 @@
             </w:pPr>
             <w:r>
               <w:rPr>
-                <w:sz w:val="18"/>
                 <w:b/>
               </w:rPr>
-              <w:t xml:space="preserve">Pre-reboot script</w:t>
+              <w:t>Pre-reboot script</w:t>
             </w:r>
           </w:p>
         </w:tc>
         <w:tc>
           <w:tcPr>
             <w:tcW w:w="3370" w:type="dxa"/>
-            <w:shd w:val="clear" w:fill="F2F4F6"/>
-            <w:vAlign w:val="center"/>
-          </w:tcPr>
-          <w:p>
-            <w:pPr>
-              <w:pStyle w:val="TableCell"/>
-            </w:pPr>
+            <w:shd w:val="clear" w:color="auto" w:fill="F2F4F6"/>
+            <w:vAlign w:val="center"/>
+          </w:tcPr>
+          <w:p>
+            <w:pPr>
+              <w:pStyle w:val="TableCell"/>
+            </w:pPr>
+            <w:r>
+              <w:t>Ran unconditionally (and, due to a latent bug, never actually executed)</w:t>
+            </w:r>
+          </w:p>
+        </w:tc>
+        <w:tc>
+          <w:tcPr>
+            <w:tcW w:w="4025" w:type="dxa"/>
+            <w:shd w:val="clear" w:color="auto" w:fill="F2F4F6"/>
+            <w:vAlign w:val="center"/>
+          </w:tcPr>
+          <w:p>
+            <w:pPr>
+              <w:pStyle w:val="TableCell"/>
+            </w:pPr>
+            <w:r>
+              <w:t xml:space="preserve">Explicit opt-in, </w:t>
+            </w:r>
             <w:r>
               <w:rPr>
-                <w:sz w:val="18"/>
-              </w:rPr>
-              <w:t xml:space="preserve">Ran unconditionally (and, due to a latent bug, never actually executed)</w:t>
-            </w:r>
-          </w:p>
-        </w:tc>
-        <w:tc>
-          <w:tcPr>
-            <w:tcW w:w="4025" w:type="dxa"/>
-            <w:shd w:val="clear" w:fill="F2F4F6"/>
-            <w:vAlign w:val="center"/>
-          </w:tcPr>
-          <w:p>
-            <w:pPr>
-              <w:pStyle w:val="TableCell"/>
-            </w:pPr>
-            <w:r>
-              <w:rPr>
-                <w:sz w:val="18"/>
-              </w:rPr>
-              <w:t xml:space="preserve">Explicit opt-in, </w:t>
-            </w:r>
-            <w:r>
-              <w:rPr>
-                <w:sz w:val="18"/>
                 <w:b/>
               </w:rPr>
-              <w:t xml:space="preserve">off by default</w:t>
-            </w:r>
-            <w:r>
-              <w:rPr>
-                <w:sz w:val="18"/>
-              </w:rPr>
-              <w:t xml:space="preserve">, pending security review</w:t>
+              <w:t>off by default</w:t>
+            </w:r>
+            <w:r>
+              <w:t>, pending security review</w:t>
             </w:r>
           </w:p>
         </w:tc>
@@ -1099,10 +1516,9 @@
             </w:pPr>
             <w:r>
               <w:rPr>
-                <w:sz w:val="18"/>
                 <w:b/>
               </w:rPr>
-              <w:t xml:space="preserve">Script delivery</w:t>
+              <w:t>Script delivery</w:t>
             </w:r>
           </w:p>
         </w:tc>
@@ -1116,10 +1532,7 @@
               <w:pStyle w:val="TableCell"/>
             </w:pPr>
             <w:r>
-              <w:rPr>
-                <w:sz w:val="18"/>
-              </w:rPr>
-              <w:t xml:space="preserve">Copied to a host every run by Ansible</w:t>
+              <w:t>Copied to a host every run by Ansible</w:t>
             </w:r>
           </w:p>
         </w:tc>
@@ -1133,10 +1546,7 @@
               <w:pStyle w:val="TableCell"/>
             </w:pPr>
             <w:r>
-              <w:rPr>
-                <w:sz w:val="18"/>
-              </w:rPr>
-              <w:t xml:space="preserve">Held and versioned in Orchestrator; copied for the run and removed afterwards — no stale copies</w:t>
+              <w:t>Held and versioned in Orchestrator; copied for the run and removed afterwards — no stale copies</w:t>
             </w:r>
           </w:p>
         </w:tc>
@@ -1148,7 +1558,7 @@
         <w:tc>
           <w:tcPr>
             <w:tcW w:w="1966" w:type="dxa"/>
-            <w:shd w:val="clear" w:fill="F2F4F6"/>
+            <w:shd w:val="clear" w:color="auto" w:fill="F2F4F6"/>
             <w:vAlign w:val="center"/>
           </w:tcPr>
           <w:p>
@@ -1157,46 +1567,39 @@
             </w:pPr>
             <w:r>
               <w:rPr>
-                <w:sz w:val="18"/>
                 <w:b/>
               </w:rPr>
-              <w:t xml:space="preserve">Wrong group picked</w:t>
+              <w:t>Wrong group picked</w:t>
             </w:r>
           </w:p>
         </w:tc>
         <w:tc>
           <w:tcPr>
             <w:tcW w:w="3370" w:type="dxa"/>
-            <w:shd w:val="clear" w:fill="F2F4F6"/>
-            <w:vAlign w:val="center"/>
-          </w:tcPr>
-          <w:p>
-            <w:pPr>
-              <w:pStyle w:val="TableCell"/>
-            </w:pPr>
-            <w:r>
-              <w:rPr>
-                <w:sz w:val="18"/>
-              </w:rPr>
-              <w:t xml:space="preserve">Looked like a clean run</w:t>
+            <w:shd w:val="clear" w:color="auto" w:fill="F2F4F6"/>
+            <w:vAlign w:val="center"/>
+          </w:tcPr>
+          <w:p>
+            <w:pPr>
+              <w:pStyle w:val="TableCell"/>
+            </w:pPr>
+            <w:r>
+              <w:t>Looked like a clean run</w:t>
             </w:r>
           </w:p>
         </w:tc>
         <w:tc>
           <w:tcPr>
             <w:tcW w:w="4025" w:type="dxa"/>
-            <w:shd w:val="clear" w:fill="F2F4F6"/>
-            <w:vAlign w:val="center"/>
-          </w:tcPr>
-          <w:p>
-            <w:pPr>
-              <w:pStyle w:val="TableCell"/>
-            </w:pPr>
-            <w:r>
-              <w:rPr>
-                <w:sz w:val="18"/>
-              </w:rPr>
-              <w:t xml:space="preserve">Run stops and says the group has no direct computer members</w:t>
+            <w:shd w:val="clear" w:color="auto" w:fill="F2F4F6"/>
+            <w:vAlign w:val="center"/>
+          </w:tcPr>
+          <w:p>
+            <w:pPr>
+              <w:pStyle w:val="TableCell"/>
+            </w:pPr>
+            <w:r>
+              <w:t>Run stops and says the group has no direct computer members</w:t>
             </w:r>
           </w:p>
         </w:tc>
@@ -1216,10 +1619,9 @@
             </w:pPr>
             <w:r>
               <w:rPr>
-                <w:sz w:val="18"/>
                 <w:b/>
               </w:rPr>
-              <w:t xml:space="preserve">Auditability</w:t>
+              <w:t>Auditability</w:t>
             </w:r>
           </w:p>
         </w:tc>
@@ -1233,10 +1635,7 @@
               <w:pStyle w:val="TableCell"/>
             </w:pPr>
             <w:r>
-              <w:rPr>
-                <w:sz w:val="18"/>
-              </w:rPr>
-              <w:t xml:space="preserve">Ansible job log</w:t>
+              <w:t>Ansible job log</w:t>
             </w:r>
           </w:p>
         </w:tc>
@@ -1250,10 +1649,7 @@
               <w:pStyle w:val="TableCell"/>
             </w:pPr>
             <w:r>
-              <w:rPr>
-                <w:sz w:val="18"/>
-              </w:rPr>
-              <w:t xml:space="preserve">Orchestrator run history, structured outputs, emailed report</w:t>
+              <w:t>Orchestrator run history, structured outputs, emailed report</w:t>
             </w:r>
           </w:p>
         </w:tc>
@@ -1269,17 +1665,15 @@
         <w:pStyle w:val="BodyText"/>
       </w:pPr>
       <w:r>
-        <w:rPr/>
         <w:t xml:space="preserve">Several of these were </w:t>
       </w:r>
       <w:r>
         <w:rPr>
           <w:b/>
         </w:rPr>
-        <w:t xml:space="preserve">pre-existing defects</w:t>
-      </w:r>
-      <w:r>
-        <w:rPr/>
+        <w:t>pre-existing defects</w:t>
+      </w:r>
+      <w:r>
         <w:t xml:space="preserve"> in the current automation that the transition uncovered and fixed (details in the Change Register): the pre-reboot step never ran, unreachable servers were force-rebooted, and failed reboots were invisible.</w:t>
       </w:r>
     </w:p>
@@ -1287,10 +1681,11 @@
       <w:pPr>
         <w:pStyle w:val="Heading1"/>
       </w:pPr>
-      <w:r>
-        <w:rPr/>
-        <w:t xml:space="preserve">Benefits</w:t>
-      </w:r>
+      <w:bookmarkStart w:id="5" w:name="_Toc241478465"/>
+      <w:r>
+        <w:t>Benefits</w:t>
+      </w:r>
+      <w:bookmarkEnd w:id="5"/>
     </w:p>
     <w:p>
       <w:pPr>
@@ -1304,10 +1699,9 @@
         <w:rPr>
           <w:b/>
         </w:rPr>
-        <w:t xml:space="preserve">Safer:</w:t>
-      </w:r>
-      <w:r>
-        <w:rPr/>
+        <w:t>Safer:</w:t>
+      </w:r>
+      <w:r>
         <w:t xml:space="preserve"> never reboots a server it could not first interrogate; never hard-boots.</w:t>
       </w:r>
     </w:p>
@@ -1323,11 +1717,18 @@
         <w:rPr>
           <w:b/>
         </w:rPr>
-        <w:t xml:space="preserve">Verifiable:</w:t>
-      </w:r>
-      <w:r>
-        <w:rPr/>
-        <w:t xml:space="preserve"> every reboot is confirmed, so a server that fails to return is surfaced instead of assumed healthy.</w:t>
+        <w:t>Verifiable:</w:t>
+      </w:r>
+      <w:r>
+        <w:t xml:space="preserve"> every reboot is confirmed, so a server that fails to return is surfaced instead of assumed </w:t>
+      </w:r>
+      <w:proofErr w:type="gramStart"/>
+      <w:r>
+        <w:t>healthy</w:t>
+      </w:r>
+      <w:proofErr w:type="gramEnd"/>
+      <w:r>
+        <w:t>.</w:t>
       </w:r>
     </w:p>
     <w:p>
@@ -1342,10 +1743,9 @@
         <w:rPr>
           <w:b/>
         </w:rPr>
-        <w:t xml:space="preserve">Auditable:</w:t>
-      </w:r>
-      <w:r>
-        <w:rPr/>
+        <w:t>Auditable:</w:t>
+      </w:r>
+      <w:r>
         <w:t xml:space="preserve"> a per-server account of every run, plus Orchestrator history.</w:t>
       </w:r>
     </w:p>
@@ -1361,10 +1761,9 @@
         <w:rPr>
           <w:b/>
         </w:rPr>
-        <w:t xml:space="preserve">Lower overhead:</w:t>
-      </w:r>
-      <w:r>
-        <w:rPr/>
+        <w:t>Lower overhead:</w:t>
+      </w:r>
+      <w:r>
         <w:t xml:space="preserve"> scheduled and centralized; nothing to stage or maintain on the PowerShell host.</w:t>
       </w:r>
     </w:p>
@@ -1380,10 +1779,9 @@
         <w:rPr>
           <w:b/>
         </w:rPr>
-        <w:t xml:space="preserve">Consistent:</w:t>
-      </w:r>
-      <w:r>
-        <w:rPr/>
+        <w:t>Consistent:</w:t>
+      </w:r>
+      <w:r>
         <w:t xml:space="preserve"> one workflow for physical and virtual servers alike.</w:t>
       </w:r>
     </w:p>
@@ -1396,10 +1794,11 @@
       <w:pPr>
         <w:pStyle w:val="Heading1"/>
       </w:pPr>
-      <w:r>
-        <w:rPr/>
-        <w:t xml:space="preserve">Key risks / decisions</w:t>
-      </w:r>
+      <w:bookmarkStart w:id="6" w:name="_Toc241478466"/>
+      <w:r>
+        <w:t>Key risks / decisions</w:t>
+      </w:r>
+      <w:bookmarkEnd w:id="6"/>
     </w:p>
     <w:p>
       <w:pPr>
@@ -1413,10 +1812,9 @@
         <w:rPr>
           <w:b/>
         </w:rPr>
-        <w:t xml:space="preserve">Scheduled runs reboot automatically.</w:t>
-      </w:r>
-      <w:r>
-        <w:rPr/>
+        <w:t>Scheduled runs reboot automatically.</w:t>
+      </w:r>
+      <w:r>
         <w:t xml:space="preserve"> Direct membership of the target AD group is the control surface: adding a computer account makes it eligible; removing or disabling it makes it ineligible. Whoever manages the group must understand this.</w:t>
       </w:r>
     </w:p>
@@ -1432,21 +1830,50 @@
         <w:rPr>
           <w:b/>
         </w:rPr>
-        <w:t xml:space="preserve">Optional pre-reboot step is security-sensitive.</w:t>
-      </w:r>
-      <w:r>
-        <w:rPr/>
-        <w:t xml:space="preserve"> It weakens USB-storage and Terminal Services file protections. It is </w:t>
-      </w:r>
+        <w:lastRenderedPageBreak/>
+        <w:t xml:space="preserve">Optional pre-reboot step is </w:t>
+      </w:r>
+      <w:proofErr w:type="gramStart"/>
       <w:r>
         <w:rPr>
           <w:b/>
         </w:rPr>
-        <w:t xml:space="preserve">off by default</w:t>
-      </w:r>
-      <w:r>
-        <w:rPr/>
-        <w:t xml:space="preserve"> and should only be enabled after security review — or retired.</w:t>
+        <w:t>security-sensitive</w:t>
+      </w:r>
+      <w:proofErr w:type="gramEnd"/>
+      <w:r>
+        <w:rPr>
+          <w:b/>
+        </w:rPr>
+        <w:t>.</w:t>
+      </w:r>
+      <w:r>
+        <w:t xml:space="preserve"> It weakens USB-storage and Terminal Services file </w:t>
+      </w:r>
+      <w:proofErr w:type="gramStart"/>
+      <w:r>
+        <w:t>protections</w:t>
+      </w:r>
+      <w:proofErr w:type="gramEnd"/>
+      <w:r>
+        <w:t xml:space="preserve">. It is </w:t>
+      </w:r>
+      <w:r>
+        <w:rPr>
+          <w:b/>
+        </w:rPr>
+        <w:t>off by default</w:t>
+      </w:r>
+      <w:r>
+        <w:t xml:space="preserve"> and should only be enabled after security review — or </w:t>
+      </w:r>
+      <w:proofErr w:type="gramStart"/>
+      <w:r>
+        <w:t>retired</w:t>
+      </w:r>
+      <w:proofErr w:type="gramEnd"/>
+      <w:r>
+        <w:t>.</w:t>
       </w:r>
     </w:p>
     <w:p>
@@ -1461,10 +1888,9 @@
         <w:rPr>
           <w:b/>
         </w:rPr>
-        <w:t xml:space="preserve">Run length vs. connection timeout.</w:t>
-      </w:r>
-      <w:r>
-        <w:rPr/>
+        <w:t>Run length vs. connection timeout.</w:t>
+      </w:r>
+      <w:r>
         <w:t xml:space="preserve"> Each run is one continuous PowerShell session (about 14 minutes for 20 pending servers). The PowerShell host's timeout must be sized to the largest group.</w:t>
       </w:r>
     </w:p>
@@ -1480,10 +1906,9 @@
         <w:rPr>
           <w:b/>
         </w:rPr>
-        <w:t xml:space="preserve">Environment rebinding on import</w:t>
-      </w:r>
-      <w:r>
-        <w:rPr/>
+        <w:t>Environment rebinding on import</w:t>
+      </w:r>
+      <w:r>
         <w:t xml:space="preserve"> — PowerShell host, script element and AD endpoints (see the Implementation Guide).</w:t>
       </w:r>
     </w:p>
@@ -1496,22 +1921,30 @@
       <w:pPr>
         <w:pStyle w:val="Heading1"/>
       </w:pPr>
-      <w:r>
-        <w:rPr/>
-        <w:t xml:space="preserve">Status</w:t>
-      </w:r>
+      <w:bookmarkStart w:id="7" w:name="_Toc241478467"/>
+      <w:r>
+        <w:t>Status</w:t>
+      </w:r>
+      <w:bookmarkEnd w:id="7"/>
     </w:p>
     <w:p>
       <w:pPr>
         <w:pStyle w:val="BodyText"/>
       </w:pPr>
       <w:r>
-        <w:rPr/>
-        <w:t xml:space="preserve">Built and running in the lab on VCF Automation 9.1.1. Report Only and live reboot runs have completed end to end, including verification of servers returning to service. Defects found on the first live run (unnecessary delay after the last server; overstated return times) are fixed. Outstanding before production: environment rebinding, WinRM timeout sizing, and the security decision on the pre-reboot step.</w:t>
+        <w:t xml:space="preserve">Built and running in the lab on VCF Automation 9.1.1. Report Only and live reboot runs have completed end to end, including verification of servers returning to service. Defects found on the first live run (unnecessary delay after the last server; overstated return times) are fixed. Outstanding before production: environment rebinding, </w:t>
+      </w:r>
+      <w:proofErr w:type="spellStart"/>
+      <w:r>
+        <w:t>WinRM</w:t>
+      </w:r>
+      <w:proofErr w:type="spellEnd"/>
+      <w:r>
+        <w:t xml:space="preserve"> timeout sizing, and the security decision on the pre-reboot step.</w:t>
       </w:r>
     </w:p>
     <w:sectPr>
-      <w:footerReference w:type="default" r:id="rId4"/>
+      <w:footerReference w:type="default" r:id="rId7"/>
       <w:pgSz w:w="12240" w:h="15840"/>
       <w:pgMar w:top="1440" w:right="1440" w:bottom="1440" w:left="1440" w:header="720" w:footer="600" w:gutter="0"/>
       <w:cols w:space="720"/>
@@ -1521,8 +1954,33 @@
 </w:document>
 </file>
 
+<file path=word/endnotes.xml><?xml version="1.0" encoding="utf-8"?>
+<w:endnotes xmlns:wpc="http://schemas.microsoft.com/office/word/2010/wordprocessingCanvas" xmlns:cx="http://schemas.microsoft.com/office/drawing/2014/chartex" xmlns:cx1="http://schemas.microsoft.com/office/drawing/2015/9/8/chartex" xmlns:cx2="http://schemas.microsoft.com/office/drawing/2015/10/21/chartex" xmlns:cx3="http://schemas.microsoft.com/office/drawing/2016/5/9/chartex" xmlns:cx4="http://schemas.microsoft.com/office/drawing/2016/5/10/chartex" xmlns:cx5="http://schemas.microsoft.com/office/drawing/2016/5/11/chartex" xmlns:cx6="http://schemas.microsoft.com/office/drawing/2016/5/12/chartex" xmlns:cx7="http://schemas.microsoft.com/office/drawing/2016/5/13/chartex" xmlns:cx8="http://schemas.microsoft.com/office/drawing/2016/5/14/chartex" xmlns:mc="http://schemas.openxmlformats.org/markup-compatibility/2006" xmlns:aink="http://schemas.microsoft.com/office/drawing/2016/ink" xmlns:am3d="http://schemas.microsoft.com/office/drawing/2017/model3d" xmlns:o="urn:schemas-microsoft-com:office:office" xmlns:oel="http://schemas.microsoft.com/office/2019/extlst" xmlns:r="http://schemas.openxmlformats.org/officeDocument/2006/relationships" xmlns:m="http://schemas.openxmlformats.org/officeDocument/2006/math" xmlns:v="urn:schemas-microsoft-com:vml" xmlns:wp14="http://schemas.microsoft.com/office/word/2010/wordprocessingDrawing" xmlns:wp="http://schemas.openxmlformats.org/drawingml/2006/wordprocessingDrawing" xmlns:w10="urn:schemas-microsoft-com:office:word" xmlns:w="http://schemas.openxmlformats.org/wordprocessingml/2006/main" xmlns:w14="http://schemas.microsoft.com/office/word/2010/wordml" xmlns:w15="http://schemas.microsoft.com/office/word/2012/wordml" xmlns:w16cex="http://schemas.microsoft.com/office/word/2018/wordml/cex" xmlns:w16cid="http://schemas.microsoft.com/office/word/2016/wordml/cid" xmlns:w16="http://schemas.microsoft.com/office/word/2018/wordml" xmlns:w16du="http://schemas.microsoft.com/office/word/2023/wordml/word16du" xmlns:w16sdtdh="http://schemas.microsoft.com/office/word/2020/wordml/sdtdatahash" xmlns:w16sdtfl="http://schemas.microsoft.com/office/word/2024/wordml/sdtformatlock" xmlns:w16se="http://schemas.microsoft.com/office/word/2015/wordml/symex" xmlns:wpg="http://schemas.microsoft.com/office/word/2010/wordprocessingGroup" xmlns:wpi="http://schemas.microsoft.com/office/word/2010/wordprocessingInk" xmlns:wne="http://schemas.microsoft.com/office/word/2006/wordml" xmlns:wps="http://schemas.microsoft.com/office/word/2010/wordprocessingShape" mc:Ignorable="w14 w15 w16se w16cid w16 w16cex w16sdtdh w16sdtfl w16du wp14">
+  <w:endnote w:type="separator" w:id="-1">
+    <w:p>
+      <w:pPr>
+        <w:spacing w:after="0" w:line="240" w:lineRule="auto"/>
+      </w:pPr>
+      <w:r>
+        <w:separator/>
+      </w:r>
+    </w:p>
+  </w:endnote>
+  <w:endnote w:type="continuationSeparator" w:id="0">
+    <w:p>
+      <w:pPr>
+        <w:spacing w:after="0" w:line="240" w:lineRule="auto"/>
+      </w:pPr>
+      <w:r>
+        <w:continuationSeparator/>
+      </w:r>
+    </w:p>
+  </w:endnote>
+</w:endnotes>
+</file>
+
 <file path=word/footer1.xml><?xml version="1.0" encoding="utf-8"?>
-<w:ftr xmlns:w="http://schemas.openxmlformats.org/wordprocessingml/2006/main">
+<w:ftr xmlns:wpc="http://schemas.microsoft.com/office/word/2010/wordprocessingCanvas" xmlns:cx="http://schemas.microsoft.com/office/drawing/2014/chartex" xmlns:cx1="http://schemas.microsoft.com/office/drawing/2015/9/8/chartex" xmlns:cx2="http://schemas.microsoft.com/office/drawing/2015/10/21/chartex" xmlns:cx3="http://schemas.microsoft.com/office/drawing/2016/5/9/chartex" xmlns:cx4="http://schemas.microsoft.com/office/drawing/2016/5/10/chartex" xmlns:cx5="http://schemas.microsoft.com/office/drawing/2016/5/11/chartex" xmlns:cx6="http://schemas.microsoft.com/office/drawing/2016/5/12/chartex" xmlns:cx7="http://schemas.microsoft.com/office/drawing/2016/5/13/chartex" xmlns:cx8="http://schemas.microsoft.com/office/drawing/2016/5/14/chartex" xmlns:mc="http://schemas.openxmlformats.org/markup-compatibility/2006" xmlns:aink="http://schemas.microsoft.com/office/drawing/2016/ink" xmlns:am3d="http://schemas.microsoft.com/office/drawing/2017/model3d" xmlns:o="urn:schemas-microsoft-com:office:office" xmlns:oel="http://schemas.microsoft.com/office/2019/extlst" xmlns:r="http://schemas.openxmlformats.org/officeDocument/2006/relationships" xmlns:m="http://schemas.openxmlformats.org/officeDocument/2006/math" xmlns:v="urn:schemas-microsoft-com:vml" xmlns:wp14="http://schemas.microsoft.com/office/word/2010/wordprocessingDrawing" xmlns:wp="http://schemas.openxmlformats.org/drawingml/2006/wordprocessingDrawing" xmlns:w10="urn:schemas-microsoft-com:office:word" xmlns:w="http://schemas.openxmlformats.org/wordprocessingml/2006/main" xmlns:w14="http://schemas.microsoft.com/office/word/2010/wordml" xmlns:w15="http://schemas.microsoft.com/office/word/2012/wordml" xmlns:w16cex="http://schemas.microsoft.com/office/word/2018/wordml/cex" xmlns:w16cid="http://schemas.microsoft.com/office/word/2016/wordml/cid" xmlns:w16="http://schemas.microsoft.com/office/word/2018/wordml" xmlns:w16du="http://schemas.microsoft.com/office/word/2023/wordml/word16du" xmlns:w16sdtdh="http://schemas.microsoft.com/office/word/2020/wordml/sdtdatahash" xmlns:w16sdtfl="http://schemas.microsoft.com/office/word/2024/wordml/sdtformatlock" xmlns:w16se="http://schemas.microsoft.com/office/word/2015/wordml/symex" xmlns:wpg="http://schemas.microsoft.com/office/word/2010/wordprocessingGroup" xmlns:wpi="http://schemas.microsoft.com/office/word/2010/wordprocessingInk" xmlns:wne="http://schemas.microsoft.com/office/word/2006/wordml" xmlns:wps="http://schemas.microsoft.com/office/word/2010/wordprocessingShape" mc:Ignorable="w14 w15 w16se w16cid w16 w16cex w16sdtdh w16sdtfl w16du wp14">
   <w:p>
     <w:pPr>
       <w:pBdr>
@@ -1535,18 +1993,34 @@
     </w:pPr>
     <w:r>
       <w:rPr>
+        <w:color w:val="8996A3"/>
         <w:sz w:val="15"/>
+      </w:rPr>
+      <w:t xml:space="preserve">Executive </w:t>
+    </w:r>
+    <w:proofErr w:type="gramStart"/>
+    <w:r>
+      <w:rPr>
         <w:color w:val="8996A3"/>
+        <w:sz w:val="15"/>
       </w:rPr>
-      <w:t xml:space="preserve">Executive Summary  |  Server Reboots</w:t>
+      <w:t>Summary  |</w:t>
+    </w:r>
+    <w:proofErr w:type="gramEnd"/>
+    <w:r>
+      <w:rPr>
+        <w:color w:val="8996A3"/>
+        <w:sz w:val="15"/>
+      </w:rPr>
+      <w:t xml:space="preserve">  Server Reboots</w:t>
     </w:r>
     <w:r>
       <w:tab/>
     </w:r>
     <w:r>
       <w:rPr>
+        <w:color w:val="8996A3"/>
         <w:sz w:val="15"/>
-        <w:color w:val="8996A3"/>
       </w:rPr>
       <w:t xml:space="preserve">Page </w:t>
     </w:r>
@@ -1561,8 +2035,8 @@
     </w:r>
     <w:r>
       <w:rPr>
+        <w:color w:val="8996A3"/>
         <w:sz w:val="15"/>
-        <w:color w:val="8996A3"/>
       </w:rPr>
       <w:t>1</w:t>
     </w:r>
@@ -1573,11 +2047,38 @@
 </w:ftr>
 </file>
 
+<file path=word/footnotes.xml><?xml version="1.0" encoding="utf-8"?>
+<w:footnotes xmlns:wpc="http://schemas.microsoft.com/office/word/2010/wordprocessingCanvas" xmlns:cx="http://schemas.microsoft.com/office/drawing/2014/chartex" xmlns:cx1="http://schemas.microsoft.com/office/drawing/2015/9/8/chartex" xmlns:cx2="http://schemas.microsoft.com/office/drawing/2015/10/21/chartex" xmlns:cx3="http://schemas.microsoft.com/office/drawing/2016/5/9/chartex" xmlns:cx4="http://schemas.microsoft.com/office/drawing/2016/5/10/chartex" xmlns:cx5="http://schemas.microsoft.com/office/drawing/2016/5/11/chartex" xmlns:cx6="http://schemas.microsoft.com/office/drawing/2016/5/12/chartex" xmlns:cx7="http://schemas.microsoft.com/office/drawing/2016/5/13/chartex" xmlns:cx8="http://schemas.microsoft.com/office/drawing/2016/5/14/chartex" xmlns:mc="http://schemas.openxmlformats.org/markup-compatibility/2006" xmlns:aink="http://schemas.microsoft.com/office/drawing/2016/ink" xmlns:am3d="http://schemas.microsoft.com/office/drawing/2017/model3d" xmlns:o="urn:schemas-microsoft-com:office:office" xmlns:oel="http://schemas.microsoft.com/office/2019/extlst" xmlns:r="http://schemas.openxmlformats.org/officeDocument/2006/relationships" xmlns:m="http://schemas.openxmlformats.org/officeDocument/2006/math" xmlns:v="urn:schemas-microsoft-com:vml" xmlns:wp14="http://schemas.microsoft.com/office/word/2010/wordprocessingDrawing" xmlns:wp="http://schemas.openxmlformats.org/drawingml/2006/wordprocessingDrawing" xmlns:w10="urn:schemas-microsoft-com:office:word" xmlns:w="http://schemas.openxmlformats.org/wordprocessingml/2006/main" xmlns:w14="http://schemas.microsoft.com/office/word/2010/wordml" xmlns:w15="http://schemas.microsoft.com/office/word/2012/wordml" xmlns:w16cex="http://schemas.microsoft.com/office/word/2018/wordml/cex" xmlns:w16cid="http://schemas.microsoft.com/office/word/2016/wordml/cid" xmlns:w16="http://schemas.microsoft.com/office/word/2018/wordml" xmlns:w16du="http://schemas.microsoft.com/office/word/2023/wordml/word16du" xmlns:w16sdtdh="http://schemas.microsoft.com/office/word/2020/wordml/sdtdatahash" xmlns:w16sdtfl="http://schemas.microsoft.com/office/word/2024/wordml/sdtformatlock" xmlns:w16se="http://schemas.microsoft.com/office/word/2015/wordml/symex" xmlns:wpg="http://schemas.microsoft.com/office/word/2010/wordprocessingGroup" xmlns:wpi="http://schemas.microsoft.com/office/word/2010/wordprocessingInk" xmlns:wne="http://schemas.microsoft.com/office/word/2006/wordml" xmlns:wps="http://schemas.microsoft.com/office/word/2010/wordprocessingShape" mc:Ignorable="w14 w15 w16se w16cid w16 w16cex w16sdtdh w16sdtfl w16du wp14">
+  <w:footnote w:type="separator" w:id="-1">
+    <w:p>
+      <w:pPr>
+        <w:spacing w:after="0" w:line="240" w:lineRule="auto"/>
+      </w:pPr>
+      <w:r>
+        <w:separator/>
+      </w:r>
+    </w:p>
+  </w:footnote>
+  <w:footnote w:type="continuationSeparator" w:id="0">
+    <w:p>
+      <w:pPr>
+        <w:spacing w:after="0" w:line="240" w:lineRule="auto"/>
+      </w:pPr>
+      <w:r>
+        <w:continuationSeparator/>
+      </w:r>
+    </w:p>
+  </w:footnote>
+</w:footnotes>
+</file>
+
 <file path=word/numbering.xml><?xml version="1.0" encoding="utf-8"?>
-<w:numbering xmlns:w="http://schemas.openxmlformats.org/wordprocessingml/2006/main">
-  <w:abstractNum w:abstractNumId="0">
+<w:numbering xmlns:wpc="http://schemas.microsoft.com/office/word/2010/wordprocessingCanvas" xmlns:cx="http://schemas.microsoft.com/office/drawing/2014/chartex" xmlns:cx1="http://schemas.microsoft.com/office/drawing/2015/9/8/chartex" xmlns:cx2="http://schemas.microsoft.com/office/drawing/2015/10/21/chartex" xmlns:cx3="http://schemas.microsoft.com/office/drawing/2016/5/9/chartex" xmlns:cx4="http://schemas.microsoft.com/office/drawing/2016/5/10/chartex" xmlns:cx5="http://schemas.microsoft.com/office/drawing/2016/5/11/chartex" xmlns:cx6="http://schemas.microsoft.com/office/drawing/2016/5/12/chartex" xmlns:cx7="http://schemas.microsoft.com/office/drawing/2016/5/13/chartex" xmlns:cx8="http://schemas.microsoft.com/office/drawing/2016/5/14/chartex" xmlns:mc="http://schemas.openxmlformats.org/markup-compatibility/2006" xmlns:aink="http://schemas.microsoft.com/office/drawing/2016/ink" xmlns:am3d="http://schemas.microsoft.com/office/drawing/2017/model3d" xmlns:o="urn:schemas-microsoft-com:office:office" xmlns:oel="http://schemas.microsoft.com/office/2019/extlst" xmlns:r="http://schemas.openxmlformats.org/officeDocument/2006/relationships" xmlns:m="http://schemas.openxmlformats.org/officeDocument/2006/math" xmlns:v="urn:schemas-microsoft-com:vml" xmlns:wp14="http://schemas.microsoft.com/office/word/2010/wordprocessingDrawing" xmlns:wp="http://schemas.openxmlformats.org/drawingml/2006/wordprocessingDrawing" xmlns:w10="urn:schemas-microsoft-com:office:word" xmlns:w="http://schemas.openxmlformats.org/wordprocessingml/2006/main" xmlns:w14="http://schemas.microsoft.com/office/word/2010/wordml" xmlns:w15="http://schemas.microsoft.com/office/word/2012/wordml" xmlns:w16cex="http://schemas.microsoft.com/office/word/2018/wordml/cex" xmlns:w16cid="http://schemas.microsoft.com/office/word/2016/wordml/cid" xmlns:w16="http://schemas.microsoft.com/office/word/2018/wordml" xmlns:w16du="http://schemas.microsoft.com/office/word/2023/wordml/word16du" xmlns:w16sdtdh="http://schemas.microsoft.com/office/word/2020/wordml/sdtdatahash" xmlns:w16sdtfl="http://schemas.microsoft.com/office/word/2024/wordml/sdtformatlock" xmlns:w16se="http://schemas.microsoft.com/office/word/2015/wordml/symex" xmlns:wpg="http://schemas.microsoft.com/office/word/2010/wordprocessingGroup" xmlns:wpi="http://schemas.microsoft.com/office/word/2010/wordprocessingInk" xmlns:wne="http://schemas.microsoft.com/office/word/2006/wordml" xmlns:wps="http://schemas.microsoft.com/office/word/2010/wordprocessingShape" mc:Ignorable="w14 w15 w16se w16cid w16 w16cex w16sdtdh w16sdtfl w16du wp14">
+  <w:abstractNum w:abstractNumId="0" w15:restartNumberingAfterBreak="0">
+    <w:nsid w:val="34140ED1"/>
     <w:multiLevelType w:val="hybridMultilevel"/>
-    <w:lvl w:ilvl="0">
+    <w:tmpl w:val="76F64BB2"/>
+    <w:lvl w:ilvl="0" w:tplc="3A7299F2">
       <w:start w:val="1"/>
       <w:numFmt w:val="bullet"/>
       <w:lvlText w:val="•"/>
@@ -1589,7 +2090,7 @@
         <w:rFonts w:ascii="Symbol" w:hAnsi="Symbol" w:hint="default"/>
       </w:rPr>
     </w:lvl>
-    <w:lvl w:ilvl="1">
+    <w:lvl w:ilvl="1" w:tplc="456CB4DE">
       <w:start w:val="1"/>
       <w:numFmt w:val="bullet"/>
       <w:lvlText w:val="o"/>
@@ -1601,10 +2102,47 @@
         <w:rFonts w:ascii="Courier New" w:hAnsi="Courier New" w:hint="default"/>
       </w:rPr>
     </w:lvl>
+    <w:lvl w:ilvl="2" w:tplc="2B7225AA">
+      <w:numFmt w:val="decimal"/>
+      <w:lvlText w:val=""/>
+      <w:lvlJc w:val="left"/>
+    </w:lvl>
+    <w:lvl w:ilvl="3" w:tplc="4BEAB6B8">
+      <w:numFmt w:val="decimal"/>
+      <w:lvlText w:val=""/>
+      <w:lvlJc w:val="left"/>
+    </w:lvl>
+    <w:lvl w:ilvl="4" w:tplc="6824A198">
+      <w:numFmt w:val="decimal"/>
+      <w:lvlText w:val=""/>
+      <w:lvlJc w:val="left"/>
+    </w:lvl>
+    <w:lvl w:ilvl="5" w:tplc="DDFCAD9A">
+      <w:numFmt w:val="decimal"/>
+      <w:lvlText w:val=""/>
+      <w:lvlJc w:val="left"/>
+    </w:lvl>
+    <w:lvl w:ilvl="6" w:tplc="87821A7C">
+      <w:numFmt w:val="decimal"/>
+      <w:lvlText w:val=""/>
+      <w:lvlJc w:val="left"/>
+    </w:lvl>
+    <w:lvl w:ilvl="7" w:tplc="4A446EF2">
+      <w:numFmt w:val="decimal"/>
+      <w:lvlText w:val=""/>
+      <w:lvlJc w:val="left"/>
+    </w:lvl>
+    <w:lvl w:ilvl="8" w:tplc="AE0CAE14">
+      <w:numFmt w:val="decimal"/>
+      <w:lvlText w:val=""/>
+      <w:lvlJc w:val="left"/>
+    </w:lvl>
   </w:abstractNum>
-  <w:abstractNum w:abstractNumId="1">
+  <w:abstractNum w:abstractNumId="1" w15:restartNumberingAfterBreak="0">
+    <w:nsid w:val="6A4B108D"/>
     <w:multiLevelType w:val="hybridMultilevel"/>
-    <w:lvl w:ilvl="0">
+    <w:tmpl w:val="62CA7C92"/>
+    <w:lvl w:ilvl="0" w:tplc="4C361DF0">
       <w:start w:val="1"/>
       <w:numFmt w:val="decimal"/>
       <w:lvlText w:val="%1."/>
@@ -1613,7 +2151,7 @@
         <w:ind w:left="360" w:hanging="270"/>
       </w:pPr>
     </w:lvl>
-    <w:lvl w:ilvl="1">
+    <w:lvl w:ilvl="1" w:tplc="03728E96">
       <w:start w:val="1"/>
       <w:numFmt w:val="lowerLetter"/>
       <w:lvlText w:val="%2."/>
@@ -1622,25 +2160,59 @@
         <w:ind w:left="720" w:hanging="270"/>
       </w:pPr>
     </w:lvl>
+    <w:lvl w:ilvl="2" w:tplc="7210694A">
+      <w:numFmt w:val="decimal"/>
+      <w:lvlText w:val=""/>
+      <w:lvlJc w:val="left"/>
+    </w:lvl>
+    <w:lvl w:ilvl="3" w:tplc="A42CBE04">
+      <w:numFmt w:val="decimal"/>
+      <w:lvlText w:val=""/>
+      <w:lvlJc w:val="left"/>
+    </w:lvl>
+    <w:lvl w:ilvl="4" w:tplc="35847BD4">
+      <w:numFmt w:val="decimal"/>
+      <w:lvlText w:val=""/>
+      <w:lvlJc w:val="left"/>
+    </w:lvl>
+    <w:lvl w:ilvl="5" w:tplc="FE22E752">
+      <w:numFmt w:val="decimal"/>
+      <w:lvlText w:val=""/>
+      <w:lvlJc w:val="left"/>
+    </w:lvl>
+    <w:lvl w:ilvl="6" w:tplc="D5E8B756">
+      <w:numFmt w:val="decimal"/>
+      <w:lvlText w:val=""/>
+      <w:lvlJc w:val="left"/>
+    </w:lvl>
+    <w:lvl w:ilvl="7" w:tplc="FCBA0568">
+      <w:numFmt w:val="decimal"/>
+      <w:lvlText w:val=""/>
+      <w:lvlJc w:val="left"/>
+    </w:lvl>
+    <w:lvl w:ilvl="8" w:tplc="DDC43C18">
+      <w:numFmt w:val="decimal"/>
+      <w:lvlText w:val=""/>
+      <w:lvlJc w:val="left"/>
+    </w:lvl>
   </w:abstractNum>
-  <w:num w:numId="1">
+  <w:num w:numId="1" w16cid:durableId="538082690">
     <w:abstractNumId w:val="0"/>
   </w:num>
-  <w:num w:numId="2">
+  <w:num w:numId="2" w16cid:durableId="19092377">
     <w:abstractNumId w:val="1"/>
   </w:num>
 </w:numbering>
 </file>
 
 <file path=word/styles.xml><?xml version="1.0" encoding="utf-8"?>
-<w:styles xmlns:w="http://schemas.openxmlformats.org/wordprocessingml/2006/main">
+<w:styles xmlns:mc="http://schemas.openxmlformats.org/markup-compatibility/2006" xmlns:r="http://schemas.openxmlformats.org/officeDocument/2006/relationships" xmlns:w="http://schemas.openxmlformats.org/wordprocessingml/2006/main" xmlns:w14="http://schemas.microsoft.com/office/word/2010/wordml" xmlns:w15="http://schemas.microsoft.com/office/word/2012/wordml" xmlns:w16cex="http://schemas.microsoft.com/office/word/2018/wordml/cex" xmlns:w16cid="http://schemas.microsoft.com/office/word/2016/wordml/cid" xmlns:w16="http://schemas.microsoft.com/office/word/2018/wordml" xmlns:w16du="http://schemas.microsoft.com/office/word/2023/wordml/word16du" xmlns:w16sdtdh="http://schemas.microsoft.com/office/word/2020/wordml/sdtdatahash" xmlns:w16sdtfl="http://schemas.microsoft.com/office/word/2024/wordml/sdtformatlock" xmlns:w16se="http://schemas.microsoft.com/office/word/2015/wordml/symex" mc:Ignorable="w14 w15 w16se w16cid w16 w16cex w16sdtdh w16sdtfl w16du">
   <w:docDefaults>
     <w:rPrDefault>
       <w:rPr>
-        <w:rFonts w:ascii="Segoe UI" w:hAnsi="Segoe UI" w:cs="Segoe UI"/>
-        <w:sz w:val="20"/>
-        <w:szCs w:val="20"/>
+        <w:rFonts w:ascii="Segoe UI" w:eastAsia="Times New Roman" w:hAnsi="Segoe UI" w:cs="Segoe UI"/>
         <w:color w:val="16202B"/>
+        <w:lang w:val="en-US" w:eastAsia="en-US" w:bidi="ar-SA"/>
       </w:rPr>
     </w:rPrDefault>
     <w:pPrDefault>
@@ -1649,8 +2221,470 @@
       </w:pPr>
     </w:pPrDefault>
   </w:docDefaults>
-  <w:style w:type="paragraph" w:styleId="Normal" w:default="1">
+  <w:latentStyles w:defLockedState="0" w:defUIPriority="99" w:defSemiHidden="0" w:defUnhideWhenUsed="0" w:defQFormat="0" w:count="376">
+    <w:lsdException w:name="Normal" w:uiPriority="0" w:qFormat="1"/>
+    <w:lsdException w:name="heading 1" w:uiPriority="9" w:qFormat="1"/>
+    <w:lsdException w:name="heading 2" w:semiHidden="1" w:uiPriority="9" w:unhideWhenUsed="1" w:qFormat="1"/>
+    <w:lsdException w:name="heading 3" w:semiHidden="1" w:uiPriority="9" w:unhideWhenUsed="1" w:qFormat="1"/>
+    <w:lsdException w:name="heading 4" w:semiHidden="1" w:uiPriority="9" w:unhideWhenUsed="1" w:qFormat="1"/>
+    <w:lsdException w:name="heading 5" w:semiHidden="1" w:uiPriority="9" w:unhideWhenUsed="1" w:qFormat="1"/>
+    <w:lsdException w:name="heading 6" w:semiHidden="1" w:uiPriority="9" w:unhideWhenUsed="1" w:qFormat="1"/>
+    <w:lsdException w:name="heading 7" w:semiHidden="1" w:uiPriority="9" w:unhideWhenUsed="1" w:qFormat="1"/>
+    <w:lsdException w:name="heading 8" w:semiHidden="1" w:uiPriority="9" w:unhideWhenUsed="1" w:qFormat="1"/>
+    <w:lsdException w:name="heading 9" w:semiHidden="1" w:uiPriority="9" w:unhideWhenUsed="1" w:qFormat="1"/>
+    <w:lsdException w:name="index 1" w:semiHidden="1" w:unhideWhenUsed="1"/>
+    <w:lsdException w:name="index 2" w:semiHidden="1" w:unhideWhenUsed="1"/>
+    <w:lsdException w:name="index 3" w:semiHidden="1" w:unhideWhenUsed="1"/>
+    <w:lsdException w:name="index 4" w:semiHidden="1" w:unhideWhenUsed="1"/>
+    <w:lsdException w:name="index 5" w:semiHidden="1" w:unhideWhenUsed="1"/>
+    <w:lsdException w:name="index 6" w:semiHidden="1" w:unhideWhenUsed="1"/>
+    <w:lsdException w:name="index 7" w:semiHidden="1" w:unhideWhenUsed="1"/>
+    <w:lsdException w:name="index 8" w:semiHidden="1" w:unhideWhenUsed="1"/>
+    <w:lsdException w:name="index 9" w:semiHidden="1" w:unhideWhenUsed="1"/>
+    <w:lsdException w:name="toc 1" w:semiHidden="1" w:uiPriority="39" w:unhideWhenUsed="1"/>
+    <w:lsdException w:name="toc 2" w:semiHidden="1" w:uiPriority="39" w:unhideWhenUsed="1"/>
+    <w:lsdException w:name="toc 3" w:semiHidden="1" w:uiPriority="39" w:unhideWhenUsed="1"/>
+    <w:lsdException w:name="toc 4" w:semiHidden="1" w:uiPriority="39" w:unhideWhenUsed="1"/>
+    <w:lsdException w:name="toc 5" w:semiHidden="1" w:uiPriority="39" w:unhideWhenUsed="1"/>
+    <w:lsdException w:name="toc 6" w:semiHidden="1" w:uiPriority="39" w:unhideWhenUsed="1"/>
+    <w:lsdException w:name="toc 7" w:semiHidden="1" w:uiPriority="39" w:unhideWhenUsed="1"/>
+    <w:lsdException w:name="toc 8" w:semiHidden="1" w:uiPriority="39" w:unhideWhenUsed="1"/>
+    <w:lsdException w:name="toc 9" w:semiHidden="1" w:uiPriority="39" w:unhideWhenUsed="1"/>
+    <w:lsdException w:name="Normal Indent" w:semiHidden="1" w:unhideWhenUsed="1"/>
+    <w:lsdException w:name="footnote text" w:semiHidden="1" w:unhideWhenUsed="1"/>
+    <w:lsdException w:name="annotation text" w:semiHidden="1" w:unhideWhenUsed="1"/>
+    <w:lsdException w:name="header" w:semiHidden="1" w:unhideWhenUsed="1"/>
+    <w:lsdException w:name="footer" w:semiHidden="1" w:unhideWhenUsed="1"/>
+    <w:lsdException w:name="index heading" w:semiHidden="1" w:unhideWhenUsed="1"/>
+    <w:lsdException w:name="caption" w:semiHidden="1" w:uiPriority="35" w:unhideWhenUsed="1" w:qFormat="1"/>
+    <w:lsdException w:name="table of figures" w:semiHidden="1" w:unhideWhenUsed="1"/>
+    <w:lsdException w:name="envelope address" w:semiHidden="1" w:unhideWhenUsed="1"/>
+    <w:lsdException w:name="envelope return" w:semiHidden="1" w:unhideWhenUsed="1"/>
+    <w:lsdException w:name="footnote reference" w:semiHidden="1" w:unhideWhenUsed="1"/>
+    <w:lsdException w:name="annotation reference" w:semiHidden="1" w:unhideWhenUsed="1"/>
+    <w:lsdException w:name="line number" w:semiHidden="1" w:unhideWhenUsed="1"/>
+    <w:lsdException w:name="page number" w:semiHidden="1" w:unhideWhenUsed="1"/>
+    <w:lsdException w:name="endnote reference" w:semiHidden="1" w:unhideWhenUsed="1"/>
+    <w:lsdException w:name="endnote text" w:semiHidden="1" w:unhideWhenUsed="1"/>
+    <w:lsdException w:name="table of authorities" w:semiHidden="1" w:unhideWhenUsed="1"/>
+    <w:lsdException w:name="macro" w:semiHidden="1" w:unhideWhenUsed="1"/>
+    <w:lsdException w:name="toa heading" w:semiHidden="1" w:unhideWhenUsed="1"/>
+    <w:lsdException w:name="List" w:semiHidden="1" w:unhideWhenUsed="1"/>
+    <w:lsdException w:name="List Bullet" w:semiHidden="1" w:unhideWhenUsed="1"/>
+    <w:lsdException w:name="List Number" w:semiHidden="1" w:unhideWhenUsed="1"/>
+    <w:lsdException w:name="List 2" w:semiHidden="1" w:unhideWhenUsed="1"/>
+    <w:lsdException w:name="List 3" w:semiHidden="1" w:unhideWhenUsed="1"/>
+    <w:lsdException w:name="List 4" w:semiHidden="1" w:unhideWhenUsed="1"/>
+    <w:lsdException w:name="List 5" w:semiHidden="1" w:unhideWhenUsed="1"/>
+    <w:lsdException w:name="List Bullet 2" w:semiHidden="1" w:unhideWhenUsed="1"/>
+    <w:lsdException w:name="List Bullet 3" w:semiHidden="1" w:unhideWhenUsed="1"/>
+    <w:lsdException w:name="List Bullet 4" w:semiHidden="1" w:unhideWhenUsed="1"/>
+    <w:lsdException w:name="List Bullet 5" w:semiHidden="1" w:unhideWhenUsed="1"/>
+    <w:lsdException w:name="List Number 2" w:semiHidden="1" w:unhideWhenUsed="1"/>
+    <w:lsdException w:name="List Number 3" w:semiHidden="1" w:unhideWhenUsed="1"/>
+    <w:lsdException w:name="List Number 4" w:semiHidden="1" w:unhideWhenUsed="1"/>
+    <w:lsdException w:name="List Number 5" w:semiHidden="1" w:unhideWhenUsed="1"/>
+    <w:lsdException w:name="Title" w:uiPriority="10" w:qFormat="1"/>
+    <w:lsdException w:name="Closing" w:semiHidden="1" w:unhideWhenUsed="1"/>
+    <w:lsdException w:name="Signature" w:semiHidden="1" w:unhideWhenUsed="1"/>
+    <w:lsdException w:name="Default Paragraph Font" w:semiHidden="1" w:uiPriority="1" w:unhideWhenUsed="1"/>
+    <w:lsdException w:name="Body Text" w:semiHidden="1" w:unhideWhenUsed="1"/>
+    <w:lsdException w:name="Body Text Indent" w:semiHidden="1" w:unhideWhenUsed="1"/>
+    <w:lsdException w:name="List Continue" w:semiHidden="1" w:unhideWhenUsed="1"/>
+    <w:lsdException w:name="List Continue 2" w:semiHidden="1" w:unhideWhenUsed="1"/>
+    <w:lsdException w:name="List Continue 3" w:semiHidden="1" w:unhideWhenUsed="1"/>
+    <w:lsdException w:name="List Continue 4" w:semiHidden="1" w:unhideWhenUsed="1"/>
+    <w:lsdException w:name="List Continue 5" w:semiHidden="1" w:unhideWhenUsed="1"/>
+    <w:lsdException w:name="Message Header" w:semiHidden="1" w:unhideWhenUsed="1"/>
+    <w:lsdException w:name="Subtitle" w:uiPriority="11" w:qFormat="1"/>
+    <w:lsdException w:name="Salutation" w:semiHidden="1" w:unhideWhenUsed="1"/>
+    <w:lsdException w:name="Date" w:semiHidden="1" w:unhideWhenUsed="1"/>
+    <w:lsdException w:name="Body Text First Indent" w:semiHidden="1" w:unhideWhenUsed="1"/>
+    <w:lsdException w:name="Body Text First Indent 2" w:semiHidden="1" w:unhideWhenUsed="1"/>
+    <w:lsdException w:name="Note Heading" w:semiHidden="1" w:unhideWhenUsed="1"/>
+    <w:lsdException w:name="Body Text 2" w:semiHidden="1" w:unhideWhenUsed="1"/>
+    <w:lsdException w:name="Body Text 3" w:semiHidden="1" w:unhideWhenUsed="1"/>
+    <w:lsdException w:name="Body Text Indent 2" w:semiHidden="1" w:unhideWhenUsed="1"/>
+    <w:lsdException w:name="Body Text Indent 3" w:semiHidden="1" w:unhideWhenUsed="1"/>
+    <w:lsdException w:name="Block Text" w:semiHidden="1" w:unhideWhenUsed="1"/>
+    <w:lsdException w:name="Hyperlink" w:semiHidden="1" w:unhideWhenUsed="1"/>
+    <w:lsdException w:name="FollowedHyperlink" w:semiHidden="1" w:unhideWhenUsed="1"/>
+    <w:lsdException w:name="Strong" w:uiPriority="22" w:qFormat="1"/>
+    <w:lsdException w:name="Emphasis" w:uiPriority="20" w:qFormat="1"/>
+    <w:lsdException w:name="Document Map" w:semiHidden="1" w:unhideWhenUsed="1"/>
+    <w:lsdException w:name="Plain Text" w:semiHidden="1" w:unhideWhenUsed="1"/>
+    <w:lsdException w:name="E-mail Signature" w:semiHidden="1" w:unhideWhenUsed="1"/>
+    <w:lsdException w:name="HTML Top of Form" w:semiHidden="1" w:unhideWhenUsed="1"/>
+    <w:lsdException w:name="HTML Bottom of Form" w:semiHidden="1" w:unhideWhenUsed="1"/>
+    <w:lsdException w:name="Normal (Web)" w:semiHidden="1" w:unhideWhenUsed="1"/>
+    <w:lsdException w:name="HTML Acronym" w:semiHidden="1" w:unhideWhenUsed="1"/>
+    <w:lsdException w:name="HTML Address" w:semiHidden="1" w:unhideWhenUsed="1"/>
+    <w:lsdException w:name="HTML Cite" w:semiHidden="1" w:unhideWhenUsed="1"/>
+    <w:lsdException w:name="HTML Code" w:semiHidden="1" w:unhideWhenUsed="1"/>
+    <w:lsdException w:name="HTML Definition" w:semiHidden="1" w:unhideWhenUsed="1"/>
+    <w:lsdException w:name="HTML Keyboard" w:semiHidden="1" w:unhideWhenUsed="1"/>
+    <w:lsdException w:name="HTML Preformatted" w:semiHidden="1" w:unhideWhenUsed="1"/>
+    <w:lsdException w:name="HTML Sample" w:semiHidden="1" w:unhideWhenUsed="1"/>
+    <w:lsdException w:name="HTML Typewriter" w:semiHidden="1" w:unhideWhenUsed="1"/>
+    <w:lsdException w:name="HTML Variable" w:semiHidden="1" w:unhideWhenUsed="1"/>
+    <w:lsdException w:name="Normal Table" w:semiHidden="1" w:unhideWhenUsed="1"/>
+    <w:lsdException w:name="annotation subject" w:semiHidden="1" w:unhideWhenUsed="1"/>
+    <w:lsdException w:name="No List" w:semiHidden="1" w:unhideWhenUsed="1"/>
+    <w:lsdException w:name="Outline List 1" w:semiHidden="1" w:unhideWhenUsed="1"/>
+    <w:lsdException w:name="Outline List 2" w:semiHidden="1" w:unhideWhenUsed="1"/>
+    <w:lsdException w:name="Outline List 3" w:semiHidden="1" w:unhideWhenUsed="1"/>
+    <w:lsdException w:name="Table Simple 1" w:semiHidden="1" w:unhideWhenUsed="1"/>
+    <w:lsdException w:name="Table Simple 2" w:semiHidden="1" w:unhideWhenUsed="1"/>
+    <w:lsdException w:name="Table Simple 3" w:semiHidden="1" w:unhideWhenUsed="1"/>
+    <w:lsdException w:name="Table Classic 1" w:semiHidden="1" w:unhideWhenUsed="1"/>
+    <w:lsdException w:name="Table Classic 2" w:semiHidden="1" w:unhideWhenUsed="1"/>
+    <w:lsdException w:name="Table Classic 3" w:semiHidden="1" w:unhideWhenUsed="1"/>
+    <w:lsdException w:name="Table Classic 4" w:semiHidden="1" w:unhideWhenUsed="1"/>
+    <w:lsdException w:name="Table Colorful 1" w:semiHidden="1" w:unhideWhenUsed="1"/>
+    <w:lsdException w:name="Table Colorful 2" w:semiHidden="1" w:unhideWhenUsed="1"/>
+    <w:lsdException w:name="Table Colorful 3" w:semiHidden="1" w:unhideWhenUsed="1"/>
+    <w:lsdException w:name="Table Columns 1" w:semiHidden="1" w:unhideWhenUsed="1"/>
+    <w:lsdException w:name="Table Columns 2" w:semiHidden="1" w:unhideWhenUsed="1"/>
+    <w:lsdException w:name="Table Columns 3" w:semiHidden="1" w:unhideWhenUsed="1"/>
+    <w:lsdException w:name="Table Columns 4" w:semiHidden="1" w:unhideWhenUsed="1"/>
+    <w:lsdException w:name="Table Columns 5" w:semiHidden="1" w:unhideWhenUsed="1"/>
+    <w:lsdException w:name="Table Grid 1" w:semiHidden="1" w:unhideWhenUsed="1"/>
+    <w:lsdException w:name="Table Grid 2" w:semiHidden="1" w:unhideWhenUsed="1"/>
+    <w:lsdException w:name="Table Grid 3" w:semiHidden="1" w:unhideWhenUsed="1"/>
+    <w:lsdException w:name="Table Grid 4" w:semiHidden="1" w:unhideWhenUsed="1"/>
+    <w:lsdException w:name="Table Grid 5" w:semiHidden="1" w:unhideWhenUsed="1"/>
+    <w:lsdException w:name="Table Grid 6" w:semiHidden="1" w:unhideWhenUsed="1"/>
+    <w:lsdException w:name="Table Grid 7" w:semiHidden="1" w:unhideWhenUsed="1"/>
+    <w:lsdException w:name="Table Grid 8" w:semiHidden="1" w:unhideWhenUsed="1"/>
+    <w:lsdException w:name="Table List 1" w:semiHidden="1" w:unhideWhenUsed="1"/>
+    <w:lsdException w:name="Table List 2" w:semiHidden="1" w:unhideWhenUsed="1"/>
+    <w:lsdException w:name="Table List 3" w:semiHidden="1" w:unhideWhenUsed="1"/>
+    <w:lsdException w:name="Table List 4" w:semiHidden="1" w:unhideWhenUsed="1"/>
+    <w:lsdException w:name="Table List 5" w:semiHidden="1" w:unhideWhenUsed="1"/>
+    <w:lsdException w:name="Table List 6" w:semiHidden="1" w:unhideWhenUsed="1"/>
+    <w:lsdException w:name="Table List 7" w:semiHidden="1" w:unhideWhenUsed="1"/>
+    <w:lsdException w:name="Table List 8" w:semiHidden="1" w:unhideWhenUsed="1"/>
+    <w:lsdException w:name="Table 3D effects 1" w:semiHidden="1" w:unhideWhenUsed="1"/>
+    <w:lsdException w:name="Table 3D effects 2" w:semiHidden="1" w:unhideWhenUsed="1"/>
+    <w:lsdException w:name="Table 3D effects 3" w:semiHidden="1" w:unhideWhenUsed="1"/>
+    <w:lsdException w:name="Table Contemporary" w:semiHidden="1" w:unhideWhenUsed="1"/>
+    <w:lsdException w:name="Table Elegant" w:semiHidden="1" w:unhideWhenUsed="1"/>
+    <w:lsdException w:name="Table Professional" w:semiHidden="1" w:unhideWhenUsed="1"/>
+    <w:lsdException w:name="Table Subtle 1" w:semiHidden="1" w:unhideWhenUsed="1"/>
+    <w:lsdException w:name="Table Subtle 2" w:semiHidden="1" w:unhideWhenUsed="1"/>
+    <w:lsdException w:name="Table Web 1" w:semiHidden="1" w:unhideWhenUsed="1"/>
+    <w:lsdException w:name="Table Web 2" w:semiHidden="1" w:unhideWhenUsed="1"/>
+    <w:lsdException w:name="Table Web 3" w:semiHidden="1" w:unhideWhenUsed="1"/>
+    <w:lsdException w:name="Balloon Text" w:semiHidden="1" w:unhideWhenUsed="1"/>
+    <w:lsdException w:name="Table Grid" w:uiPriority="39"/>
+    <w:lsdException w:name="Table Theme" w:semiHidden="1" w:unhideWhenUsed="1"/>
+    <w:lsdException w:name="Placeholder Text" w:semiHidden="1"/>
+    <w:lsdException w:name="No Spacing" w:uiPriority="1" w:qFormat="1"/>
+    <w:lsdException w:name="Light Shading" w:uiPriority="60"/>
+    <w:lsdException w:name="Light List" w:uiPriority="61"/>
+    <w:lsdException w:name="Light Grid" w:uiPriority="62"/>
+    <w:lsdException w:name="Medium Shading 1" w:uiPriority="63"/>
+    <w:lsdException w:name="Medium Shading 2" w:uiPriority="64"/>
+    <w:lsdException w:name="Medium List 1" w:uiPriority="65"/>
+    <w:lsdException w:name="Medium List 2" w:uiPriority="66"/>
+    <w:lsdException w:name="Medium Grid 1" w:uiPriority="67"/>
+    <w:lsdException w:name="Medium Grid 2" w:uiPriority="68"/>
+    <w:lsdException w:name="Medium Grid 3" w:uiPriority="69"/>
+    <w:lsdException w:name="Dark List" w:uiPriority="70"/>
+    <w:lsdException w:name="Colorful Shading" w:uiPriority="71"/>
+    <w:lsdException w:name="Colorful List" w:uiPriority="72"/>
+    <w:lsdException w:name="Colorful Grid" w:uiPriority="73"/>
+    <w:lsdException w:name="Light Shading Accent 1" w:uiPriority="60"/>
+    <w:lsdException w:name="Light List Accent 1" w:uiPriority="61"/>
+    <w:lsdException w:name="Light Grid Accent 1" w:uiPriority="62"/>
+    <w:lsdException w:name="Medium Shading 1 Accent 1" w:uiPriority="63"/>
+    <w:lsdException w:name="Medium Shading 2 Accent 1" w:uiPriority="64"/>
+    <w:lsdException w:name="Medium List 1 Accent 1" w:uiPriority="65"/>
+    <w:lsdException w:name="Revision" w:semiHidden="1"/>
+    <w:lsdException w:name="List Paragraph" w:uiPriority="34" w:qFormat="1"/>
+    <w:lsdException w:name="Quote" w:uiPriority="29" w:qFormat="1"/>
+    <w:lsdException w:name="Intense Quote" w:uiPriority="30" w:qFormat="1"/>
+    <w:lsdException w:name="Medium List 2 Accent 1" w:uiPriority="66"/>
+    <w:lsdException w:name="Medium Grid 1 Accent 1" w:uiPriority="67"/>
+    <w:lsdException w:name="Medium Grid 2 Accent 1" w:uiPriority="68"/>
+    <w:lsdException w:name="Medium Grid 3 Accent 1" w:uiPriority="69"/>
+    <w:lsdException w:name="Dark List Accent 1" w:uiPriority="70"/>
+    <w:lsdException w:name="Colorful Shading Accent 1" w:uiPriority="71"/>
+    <w:lsdException w:name="Colorful List Accent 1" w:uiPriority="72"/>
+    <w:lsdException w:name="Colorful Grid Accent 1" w:uiPriority="73"/>
+    <w:lsdException w:name="Light Shading Accent 2" w:uiPriority="60"/>
+    <w:lsdException w:name="Light List Accent 2" w:uiPriority="61"/>
+    <w:lsdException w:name="Light Grid Accent 2" w:uiPriority="62"/>
+    <w:lsdException w:name="Medium Shading 1 Accent 2" w:uiPriority="63"/>
+    <w:lsdException w:name="Medium Shading 2 Accent 2" w:uiPriority="64"/>
+    <w:lsdException w:name="Medium List 1 Accent 2" w:uiPriority="65"/>
+    <w:lsdException w:name="Medium List 2 Accent 2" w:uiPriority="66"/>
+    <w:lsdException w:name="Medium Grid 1 Accent 2" w:uiPriority="67"/>
+    <w:lsdException w:name="Medium Grid 2 Accent 2" w:uiPriority="68"/>
+    <w:lsdException w:name="Medium Grid 3 Accent 2" w:uiPriority="69"/>
+    <w:lsdException w:name="Dark List Accent 2" w:uiPriority="70"/>
+    <w:lsdException w:name="Colorful Shading Accent 2" w:uiPriority="71"/>
+    <w:lsdException w:name="Colorful List Accent 2" w:uiPriority="72"/>
+    <w:lsdException w:name="Colorful Grid Accent 2" w:uiPriority="73"/>
+    <w:lsdException w:name="Light Shading Accent 3" w:uiPriority="60"/>
+    <w:lsdException w:name="Light List Accent 3" w:uiPriority="61"/>
+    <w:lsdException w:name="Light Grid Accent 3" w:uiPriority="62"/>
+    <w:lsdException w:name="Medium Shading 1 Accent 3" w:uiPriority="63"/>
+    <w:lsdException w:name="Medium Shading 2 Accent 3" w:uiPriority="64"/>
+    <w:lsdException w:name="Medium List 1 Accent 3" w:uiPriority="65"/>
+    <w:lsdException w:name="Medium List 2 Accent 3" w:uiPriority="66"/>
+    <w:lsdException w:name="Medium Grid 1 Accent 3" w:uiPriority="67"/>
+    <w:lsdException w:name="Medium Grid 2 Accent 3" w:uiPriority="68"/>
+    <w:lsdException w:name="Medium Grid 3 Accent 3" w:uiPriority="69"/>
+    <w:lsdException w:name="Dark List Accent 3" w:uiPriority="70"/>
+    <w:lsdException w:name="Colorful Shading Accent 3" w:uiPriority="71"/>
+    <w:lsdException w:name="Colorful List Accent 3" w:uiPriority="72"/>
+    <w:lsdException w:name="Colorful Grid Accent 3" w:uiPriority="73"/>
+    <w:lsdException w:name="Light Shading Accent 4" w:uiPriority="60"/>
+    <w:lsdException w:name="Light List Accent 4" w:uiPriority="61"/>
+    <w:lsdException w:name="Light Grid Accent 4" w:uiPriority="62"/>
+    <w:lsdException w:name="Medium Shading 1 Accent 4" w:uiPriority="63"/>
+    <w:lsdException w:name="Medium Shading 2 Accent 4" w:uiPriority="64"/>
+    <w:lsdException w:name="Medium List 1 Accent 4" w:uiPriority="65"/>
+    <w:lsdException w:name="Medium List 2 Accent 4" w:uiPriority="66"/>
+    <w:lsdException w:name="Medium Grid 1 Accent 4" w:uiPriority="67"/>
+    <w:lsdException w:name="Medium Grid 2 Accent 4" w:uiPriority="68"/>
+    <w:lsdException w:name="Medium Grid 3 Accent 4" w:uiPriority="69"/>
+    <w:lsdException w:name="Dark List Accent 4" w:uiPriority="70"/>
+    <w:lsdException w:name="Colorful Shading Accent 4" w:uiPriority="71"/>
+    <w:lsdException w:name="Colorful List Accent 4" w:uiPriority="72"/>
+    <w:lsdException w:name="Colorful Grid Accent 4" w:uiPriority="73"/>
+    <w:lsdException w:name="Light Shading Accent 5" w:uiPriority="60"/>
+    <w:lsdException w:name="Light List Accent 5" w:uiPriority="61"/>
+    <w:lsdException w:name="Light Grid Accent 5" w:uiPriority="62"/>
+    <w:lsdException w:name="Medium Shading 1 Accent 5" w:uiPriority="63"/>
+    <w:lsdException w:name="Medium Shading 2 Accent 5" w:uiPriority="64"/>
+    <w:lsdException w:name="Medium List 1 Accent 5" w:uiPriority="65"/>
+    <w:lsdException w:name="Medium List 2 Accent 5" w:uiPriority="66"/>
+    <w:lsdException w:name="Medium Grid 1 Accent 5" w:uiPriority="67"/>
+    <w:lsdException w:name="Medium Grid 2 Accent 5" w:uiPriority="68"/>
+    <w:lsdException w:name="Medium Grid 3 Accent 5" w:uiPriority="69"/>
+    <w:lsdException w:name="Dark List Accent 5" w:uiPriority="70"/>
+    <w:lsdException w:name="Colorful Shading Accent 5" w:uiPriority="71"/>
+    <w:lsdException w:name="Colorful List Accent 5" w:uiPriority="72"/>
+    <w:lsdException w:name="Colorful Grid Accent 5" w:uiPriority="73"/>
+    <w:lsdException w:name="Light Shading Accent 6" w:uiPriority="60"/>
+    <w:lsdException w:name="Light List Accent 6" w:uiPriority="61"/>
+    <w:lsdException w:name="Light Grid Accent 6" w:uiPriority="62"/>
+    <w:lsdException w:name="Medium Shading 1 Accent 6" w:uiPriority="63"/>
+    <w:lsdException w:name="Medium Shading 2 Accent 6" w:uiPriority="64"/>
+    <w:lsdException w:name="Medium List 1 Accent 6" w:uiPriority="65"/>
+    <w:lsdException w:name="Medium List 2 Accent 6" w:uiPriority="66"/>
+    <w:lsdException w:name="Medium Grid 1 Accent 6" w:uiPriority="67"/>
+    <w:lsdException w:name="Medium Grid 2 Accent 6" w:uiPriority="68"/>
+    <w:lsdException w:name="Medium Grid 3 Accent 6" w:uiPriority="69"/>
+    <w:lsdException w:name="Dark List Accent 6" w:uiPriority="70"/>
+    <w:lsdException w:name="Colorful Shading Accent 6" w:uiPriority="71"/>
+    <w:lsdException w:name="Colorful List Accent 6" w:uiPriority="72"/>
+    <w:lsdException w:name="Colorful Grid Accent 6" w:uiPriority="73"/>
+    <w:lsdException w:name="Subtle Emphasis" w:uiPriority="19" w:qFormat="1"/>
+    <w:lsdException w:name="Intense Emphasis" w:uiPriority="21" w:qFormat="1"/>
+    <w:lsdException w:name="Subtle Reference" w:uiPriority="31" w:qFormat="1"/>
+    <w:lsdException w:name="Intense Reference" w:uiPriority="32" w:qFormat="1"/>
+    <w:lsdException w:name="Book Title" w:uiPriority="33" w:qFormat="1"/>
+    <w:lsdException w:name="Bibliography" w:semiHidden="1" w:uiPriority="37" w:unhideWhenUsed="1"/>
+    <w:lsdException w:name="TOC Heading" w:semiHidden="1" w:uiPriority="39" w:unhideWhenUsed="1" w:qFormat="1"/>
+    <w:lsdException w:name="Plain Table 1" w:uiPriority="41"/>
+    <w:lsdException w:name="Plain Table 2" w:uiPriority="42"/>
+    <w:lsdException w:name="Plain Table 3" w:uiPriority="43"/>
+    <w:lsdException w:name="Plain Table 4" w:uiPriority="44"/>
+    <w:lsdException w:name="Plain Table 5" w:uiPriority="45"/>
+    <w:lsdException w:name="Grid Table Light" w:uiPriority="40"/>
+    <w:lsdException w:name="Grid Table 1 Light" w:uiPriority="46"/>
+    <w:lsdException w:name="Grid Table 2" w:uiPriority="47"/>
+    <w:lsdException w:name="Grid Table 3" w:uiPriority="48"/>
+    <w:lsdException w:name="Grid Table 4" w:uiPriority="49"/>
+    <w:lsdException w:name="Grid Table 5 Dark" w:uiPriority="50"/>
+    <w:lsdException w:name="Grid Table 6 Colorful" w:uiPriority="51"/>
+    <w:lsdException w:name="Grid Table 7 Colorful" w:uiPriority="52"/>
+    <w:lsdException w:name="Grid Table 1 Light Accent 1" w:uiPriority="46"/>
+    <w:lsdException w:name="Grid Table 2 Accent 1" w:uiPriority="47"/>
+    <w:lsdException w:name="Grid Table 3 Accent 1" w:uiPriority="48"/>
+    <w:lsdException w:name="Grid Table 4 Accent 1" w:uiPriority="49"/>
+    <w:lsdException w:name="Grid Table 5 Dark Accent 1" w:uiPriority="50"/>
+    <w:lsdException w:name="Grid Table 6 Colorful Accent 1" w:uiPriority="51"/>
+    <w:lsdException w:name="Grid Table 7 Colorful Accent 1" w:uiPriority="52"/>
+    <w:lsdException w:name="Grid Table 1 Light Accent 2" w:uiPriority="46"/>
+    <w:lsdException w:name="Grid Table 2 Accent 2" w:uiPriority="47"/>
+    <w:lsdException w:name="Grid Table 3 Accent 2" w:uiPriority="48"/>
+    <w:lsdException w:name="Grid Table 4 Accent 2" w:uiPriority="49"/>
+    <w:lsdException w:name="Grid Table 5 Dark Accent 2" w:uiPriority="50"/>
+    <w:lsdException w:name="Grid Table 6 Colorful Accent 2" w:uiPriority="51"/>
+    <w:lsdException w:name="Grid Table 7 Colorful Accent 2" w:uiPriority="52"/>
+    <w:lsdException w:name="Grid Table 1 Light Accent 3" w:uiPriority="46"/>
+    <w:lsdException w:name="Grid Table 2 Accent 3" w:uiPriority="47"/>
+    <w:lsdException w:name="Grid Table 3 Accent 3" w:uiPriority="48"/>
+    <w:lsdException w:name="Grid Table 4 Accent 3" w:uiPriority="49"/>
+    <w:lsdException w:name="Grid Table 5 Dark Accent 3" w:uiPriority="50"/>
+    <w:lsdException w:name="Grid Table 6 Colorful Accent 3" w:uiPriority="51"/>
+    <w:lsdException w:name="Grid Table 7 Colorful Accent 3" w:uiPriority="52"/>
+    <w:lsdException w:name="Grid Table 1 Light Accent 4" w:uiPriority="46"/>
+    <w:lsdException w:name="Grid Table 2 Accent 4" w:uiPriority="47"/>
+    <w:lsdException w:name="Grid Table 3 Accent 4" w:uiPriority="48"/>
+    <w:lsdException w:name="Grid Table 4 Accent 4" w:uiPriority="49"/>
+    <w:lsdException w:name="Grid Table 5 Dark Accent 4" w:uiPriority="50"/>
+    <w:lsdException w:name="Grid Table 6 Colorful Accent 4" w:uiPriority="51"/>
+    <w:lsdException w:name="Grid Table 7 Colorful Accent 4" w:uiPriority="52"/>
+    <w:lsdException w:name="Grid Table 1 Light Accent 5" w:uiPriority="46"/>
+    <w:lsdException w:name="Grid Table 2 Accent 5" w:uiPriority="47"/>
+    <w:lsdException w:name="Grid Table 3 Accent 5" w:uiPriority="48"/>
+    <w:lsdException w:name="Grid Table 4 Accent 5" w:uiPriority="49"/>
+    <w:lsdException w:name="Grid Table 5 Dark Accent 5" w:uiPriority="50"/>
+    <w:lsdException w:name="Grid Table 6 Colorful Accent 5" w:uiPriority="51"/>
+    <w:lsdException w:name="Grid Table 7 Colorful Accent 5" w:uiPriority="52"/>
+    <w:lsdException w:name="Grid Table 1 Light Accent 6" w:uiPriority="46"/>
+    <w:lsdException w:name="Grid Table 2 Accent 6" w:uiPriority="47"/>
+    <w:lsdException w:name="Grid Table 3 Accent 6" w:uiPriority="48"/>
+    <w:lsdException w:name="Grid Table 4 Accent 6" w:uiPriority="49"/>
+    <w:lsdException w:name="Grid Table 5 Dark Accent 6" w:uiPriority="50"/>
+    <w:lsdException w:name="Grid Table 6 Colorful Accent 6" w:uiPriority="51"/>
+    <w:lsdException w:name="Grid Table 7 Colorful Accent 6" w:uiPriority="52"/>
+    <w:lsdException w:name="List Table 1 Light" w:uiPriority="46"/>
+    <w:lsdException w:name="List Table 2" w:uiPriority="47"/>
+    <w:lsdException w:name="List Table 3" w:uiPriority="48"/>
+    <w:lsdException w:name="List Table 4" w:uiPriority="49"/>
+    <w:lsdException w:name="List Table 5 Dark" w:uiPriority="50"/>
+    <w:lsdException w:name="List Table 6 Colorful" w:uiPriority="51"/>
+    <w:lsdException w:name="List Table 7 Colorful" w:uiPriority="52"/>
+    <w:lsdException w:name="List Table 1 Light Accent 1" w:uiPriority="46"/>
+    <w:lsdException w:name="List Table 2 Accent 1" w:uiPriority="47"/>
+    <w:lsdException w:name="List Table 3 Accent 1" w:uiPriority="48"/>
+    <w:lsdException w:name="List Table 4 Accent 1" w:uiPriority="49"/>
+    <w:lsdException w:name="List Table 5 Dark Accent 1" w:uiPriority="50"/>
+    <w:lsdException w:name="List Table 6 Colorful Accent 1" w:uiPriority="51"/>
+    <w:lsdException w:name="List Table 7 Colorful Accent 1" w:uiPriority="52"/>
+    <w:lsdException w:name="List Table 1 Light Accent 2" w:uiPriority="46"/>
+    <w:lsdException w:name="List Table 2 Accent 2" w:uiPriority="47"/>
+    <w:lsdException w:name="List Table 3 Accent 2" w:uiPriority="48"/>
+    <w:lsdException w:name="List Table 4 Accent 2" w:uiPriority="49"/>
+    <w:lsdException w:name="List Table 5 Dark Accent 2" w:uiPriority="50"/>
+    <w:lsdException w:name="List Table 6 Colorful Accent 2" w:uiPriority="51"/>
+    <w:lsdException w:name="List Table 7 Colorful Accent 2" w:uiPriority="52"/>
+    <w:lsdException w:name="List Table 1 Light Accent 3" w:uiPriority="46"/>
+    <w:lsdException w:name="List Table 2 Accent 3" w:uiPriority="47"/>
+    <w:lsdException w:name="List Table 3 Accent 3" w:uiPriority="48"/>
+    <w:lsdException w:name="List Table 4 Accent 3" w:uiPriority="49"/>
+    <w:lsdException w:name="List Table 5 Dark Accent 3" w:uiPriority="50"/>
+    <w:lsdException w:name="List Table 6 Colorful Accent 3" w:uiPriority="51"/>
+    <w:lsdException w:name="List Table 7 Colorful Accent 3" w:uiPriority="52"/>
+    <w:lsdException w:name="List Table 1 Light Accent 4" w:uiPriority="46"/>
+    <w:lsdException w:name="List Table 2 Accent 4" w:uiPriority="47"/>
+    <w:lsdException w:name="List Table 3 Accent 4" w:uiPriority="48"/>
+    <w:lsdException w:name="List Table 4 Accent 4" w:uiPriority="49"/>
+    <w:lsdException w:name="List Table 5 Dark Accent 4" w:uiPriority="50"/>
+    <w:lsdException w:name="List Table 6 Colorful Accent 4" w:uiPriority="51"/>
+    <w:lsdException w:name="List Table 7 Colorful Accent 4" w:uiPriority="52"/>
+    <w:lsdException w:name="List Table 1 Light Accent 5" w:uiPriority="46"/>
+    <w:lsdException w:name="List Table 2 Accent 5" w:uiPriority="47"/>
+    <w:lsdException w:name="List Table 3 Accent 5" w:uiPriority="48"/>
+    <w:lsdException w:name="List Table 4 Accent 5" w:uiPriority="49"/>
+    <w:lsdException w:name="List Table 5 Dark Accent 5" w:uiPriority="50"/>
+    <w:lsdException w:name="List Table 6 Colorful Accent 5" w:uiPriority="51"/>
+    <w:lsdException w:name="List Table 7 Colorful Accent 5" w:uiPriority="52"/>
+    <w:lsdException w:name="List Table 1 Light Accent 6" w:uiPriority="46"/>
+    <w:lsdException w:name="List Table 2 Accent 6" w:uiPriority="47"/>
+    <w:lsdException w:name="List Table 3 Accent 6" w:uiPriority="48"/>
+    <w:lsdException w:name="List Table 4 Accent 6" w:uiPriority="49"/>
+    <w:lsdException w:name="List Table 5 Dark Accent 6" w:uiPriority="50"/>
+    <w:lsdException w:name="List Table 6 Colorful Accent 6" w:uiPriority="51"/>
+    <w:lsdException w:name="List Table 7 Colorful Accent 6" w:uiPriority="52"/>
+    <w:lsdException w:name="Mention" w:semiHidden="1" w:unhideWhenUsed="1"/>
+    <w:lsdException w:name="Smart Hyperlink" w:semiHidden="1" w:unhideWhenUsed="1"/>
+    <w:lsdException w:name="Hashtag" w:semiHidden="1" w:unhideWhenUsed="1"/>
+    <w:lsdException w:name="Unresolved Mention" w:semiHidden="1" w:unhideWhenUsed="1"/>
+    <w:lsdException w:name="Smart Link" w:semiHidden="1" w:unhideWhenUsed="1"/>
+  </w:latentStyles>
+  <w:style w:type="paragraph" w:default="1" w:styleId="Normal">
     <w:name w:val="Normal"/>
+    <w:qFormat/>
+  </w:style>
+  <w:style w:type="paragraph" w:styleId="Heading1">
+    <w:name w:val="heading 1"/>
+    <w:basedOn w:val="Normal"/>
+    <w:next w:val="BodyText"/>
+    <w:uiPriority w:val="9"/>
+    <w:qFormat/>
+    <w:pPr>
+      <w:keepNext/>
+      <w:pBdr>
+        <w:bottom w:val="single" w:sz="6" w:space="6" w:color="D4DAE1"/>
+      </w:pBdr>
+      <w:spacing w:before="360"/>
+      <w:outlineLvl w:val="0"/>
+    </w:pPr>
+    <w:rPr>
+      <w:b/>
+      <w:sz w:val="32"/>
+    </w:rPr>
+  </w:style>
+  <w:style w:type="paragraph" w:styleId="Heading2">
+    <w:name w:val="heading 2"/>
+    <w:basedOn w:val="Normal"/>
+    <w:next w:val="BodyText"/>
+    <w:uiPriority w:val="9"/>
+    <w:semiHidden/>
+    <w:unhideWhenUsed/>
+    <w:qFormat/>
+    <w:pPr>
+      <w:keepNext/>
+      <w:spacing w:before="280" w:after="100"/>
+      <w:outlineLvl w:val="1"/>
+    </w:pPr>
+    <w:rPr>
+      <w:b/>
+      <w:color w:val="1F5C8B"/>
+      <w:sz w:val="24"/>
+    </w:rPr>
+  </w:style>
+  <w:style w:type="paragraph" w:styleId="Heading3">
+    <w:name w:val="heading 3"/>
+    <w:basedOn w:val="Normal"/>
+    <w:next w:val="BodyText"/>
+    <w:uiPriority w:val="9"/>
+    <w:semiHidden/>
+    <w:unhideWhenUsed/>
+    <w:qFormat/>
+    <w:pPr>
+      <w:keepNext/>
+      <w:spacing w:before="220" w:after="80"/>
+      <w:outlineLvl w:val="2"/>
+    </w:pPr>
+    <w:rPr>
+      <w:b/>
+      <w:sz w:val="21"/>
+    </w:rPr>
+  </w:style>
+  <w:style w:type="character" w:default="1" w:styleId="DefaultParagraphFont">
+    <w:name w:val="Default Paragraph Font"/>
+    <w:uiPriority w:val="1"/>
+    <w:semiHidden/>
+    <w:unhideWhenUsed/>
+  </w:style>
+  <w:style w:type="table" w:default="1" w:styleId="TableNormal">
+    <w:name w:val="Normal Table"/>
+    <w:uiPriority w:val="99"/>
+    <w:semiHidden/>
+    <w:unhideWhenUsed/>
+    <w:tblPr>
+      <w:tblInd w:w="0" w:type="dxa"/>
+      <w:tblCellMar>
+        <w:top w:w="0" w:type="dxa"/>
+        <w:left w:w="108" w:type="dxa"/>
+        <w:bottom w:w="0" w:type="dxa"/>
+        <w:right w:w="108" w:type="dxa"/>
+      </w:tblCellMar>
+    </w:tblPr>
+  </w:style>
+  <w:style w:type="numbering" w:default="1" w:styleId="NoList">
+    <w:name w:val="No List"/>
+    <w:uiPriority w:val="99"/>
+    <w:semiHidden/>
+    <w:unhideWhenUsed/>
   </w:style>
   <w:style w:type="paragraph" w:styleId="BodyText">
     <w:name w:val="Body Text"/>
@@ -1660,30 +2694,31 @@
     <w:name w:val="Title"/>
     <w:basedOn w:val="Normal"/>
     <w:next w:val="BodyText"/>
+    <w:uiPriority w:val="10"/>
+    <w:qFormat/>
     <w:pPr>
-      <w:spacing w:before="0" w:after="80"/>
+      <w:spacing w:after="80"/>
     </w:pPr>
     <w:rPr>
-      <w:rFonts w:ascii="Segoe UI" w:hAnsi="Segoe UI" w:cs="Segoe UI"/>
+      <w:b/>
       <w:sz w:val="52"/>
-      <w:b/>
-      <w:color w:val="16202B"/>
     </w:rPr>
   </w:style>
   <w:style w:type="paragraph" w:styleId="Subtitle">
     <w:name w:val="Subtitle"/>
     <w:basedOn w:val="Normal"/>
     <w:next w:val="BodyText"/>
+    <w:uiPriority w:val="11"/>
+    <w:qFormat/>
     <w:pPr>
       <w:spacing w:after="360"/>
     </w:pPr>
     <w:rPr>
-      <w:rFonts w:ascii="Segoe UI" w:hAnsi="Segoe UI" w:cs="Segoe UI"/>
+      <w:color w:val="5B6875"/>
       <w:sz w:val="24"/>
-      <w:color w:val="5B6875"/>
     </w:rPr>
   </w:style>
-  <w:style w:type="paragraph" w:styleId="Eyebrow">
+  <w:style w:type="paragraph" w:customStyle="1" w:styleId="Eyebrow">
     <w:name w:val="Eyebrow"/>
     <w:basedOn w:val="Normal"/>
     <w:next w:val="Title"/>
@@ -1691,62 +2726,10 @@
       <w:spacing w:after="60"/>
     </w:pPr>
     <w:rPr>
-      <w:rFonts w:ascii="Segoe UI" w:hAnsi="Segoe UI" w:cs="Segoe UI"/>
-      <w:sz w:val="16"/>
       <w:b/>
       <w:caps/>
       <w:color w:val="8996A3"/>
-    </w:rPr>
-  </w:style>
-  <w:style w:type="paragraph" w:styleId="Heading1">
-    <w:name w:val="heading 1"/>
-    <w:basedOn w:val="Normal"/>
-    <w:next w:val="BodyText"/>
-    <w:pPr>
-      <w:outlineLvl w:val="0"/>
-      <w:spacing w:before="360" w:after="140"/>
-      <w:keepNext/>
-      <w:pBdr>
-        <w:bottom w:val="single" w:sz="6" w:space="6" w:color="D4DAE1"/>
-      </w:pBdr>
-    </w:pPr>
-    <w:rPr>
-      <w:rFonts w:ascii="Segoe UI" w:hAnsi="Segoe UI" w:cs="Segoe UI"/>
-      <w:sz w:val="32"/>
-      <w:b/>
-      <w:color w:val="16202B"/>
-    </w:rPr>
-  </w:style>
-  <w:style w:type="paragraph" w:styleId="Heading2">
-    <w:name w:val="heading 2"/>
-    <w:basedOn w:val="Normal"/>
-    <w:next w:val="BodyText"/>
-    <w:pPr>
-      <w:outlineLvl w:val="1"/>
-      <w:spacing w:before="280" w:after="100"/>
-      <w:keepNext/>
-    </w:pPr>
-    <w:rPr>
-      <w:rFonts w:ascii="Segoe UI" w:hAnsi="Segoe UI" w:cs="Segoe UI"/>
-      <w:sz w:val="24"/>
-      <w:b/>
-      <w:color w:val="1F5C8B"/>
-    </w:rPr>
-  </w:style>
-  <w:style w:type="paragraph" w:styleId="Heading3">
-    <w:name w:val="heading 3"/>
-    <w:basedOn w:val="Normal"/>
-    <w:next w:val="BodyText"/>
-    <w:pPr>
-      <w:outlineLvl w:val="2"/>
-      <w:spacing w:before="220" w:after="80"/>
-      <w:keepNext/>
-    </w:pPr>
-    <w:rPr>
-      <w:rFonts w:ascii="Segoe UI" w:hAnsi="Segoe UI" w:cs="Segoe UI"/>
-      <w:sz w:val="21"/>
-      <w:b/>
-      <w:color w:val="16202B"/>
+      <w:sz w:val="16"/>
     </w:rPr>
   </w:style>
   <w:style w:type="paragraph" w:styleId="Caption">
@@ -1754,21 +2737,20 @@
     <w:basedOn w:val="Normal"/>
     <w:next w:val="BodyText"/>
     <w:pPr>
+      <w:spacing w:after="240"/>
       <w:jc w:val="center"/>
-      <w:spacing w:after="240"/>
     </w:pPr>
     <w:rPr>
-      <w:rFonts w:ascii="Segoe UI" w:hAnsi="Segoe UI" w:cs="Segoe UI"/>
-      <w:sz w:val="17"/>
       <w:i/>
       <w:color w:val="5B6875"/>
+      <w:sz w:val="17"/>
     </w:rPr>
   </w:style>
-  <w:style w:type="paragraph" w:styleId="CodeBlock">
+  <w:style w:type="paragraph" w:customStyle="1" w:styleId="CodeBlock">
     <w:name w:val="Code Block"/>
     <w:basedOn w:val="Normal"/>
     <w:pPr>
-      <w:shd w:val="clear" w:fill="F7F9FA"/>
+      <w:shd w:val="clear" w:color="auto" w:fill="F7F9FA"/>
       <w:spacing w:after="0" w:line="240" w:lineRule="auto"/>
       <w:ind w:left="120"/>
     </w:pPr>
@@ -1777,7 +2759,7 @@
       <w:sz w:val="17"/>
     </w:rPr>
   </w:style>
-  <w:style w:type="paragraph" w:styleId="TableCell">
+  <w:style w:type="paragraph" w:customStyle="1" w:styleId="TableCell">
     <w:name w:val="Table Cell"/>
     <w:basedOn w:val="Normal"/>
     <w:pPr>
@@ -1791,9 +2773,9 @@
     <w:name w:val="List Paragraph"/>
     <w:basedOn w:val="Normal"/>
     <w:pPr>
+      <w:spacing w:after="60"/>
       <w:ind w:left="360"/>
       <w:contextualSpacing/>
-      <w:spacing w:after="60"/>
     </w:pPr>
   </w:style>
   <w:style w:type="table" w:styleId="TableGrid">
@@ -1807,5 +2789,343 @@
       </w:tblCellMar>
     </w:tblPr>
   </w:style>
+  <w:style w:type="paragraph" w:styleId="TOC1">
+    <w:name w:val="toc 1"/>
+    <w:basedOn w:val="Normal"/>
+    <w:next w:val="Normal"/>
+    <w:autoRedefine/>
+    <w:uiPriority w:val="39"/>
+    <w:unhideWhenUsed/>
+    <w:rsid w:val="00FC3839"/>
+    <w:pPr>
+      <w:spacing w:after="100"/>
+    </w:pPr>
+  </w:style>
+  <w:style w:type="character" w:styleId="Hyperlink">
+    <w:name w:val="Hyperlink"/>
+    <w:basedOn w:val="DefaultParagraphFont"/>
+    <w:uiPriority w:val="99"/>
+    <w:unhideWhenUsed/>
+    <w:rsid w:val="00FC3839"/>
+    <w:rPr>
+      <w:color w:val="467886" w:themeColor="hyperlink"/>
+      <w:u w:val="single"/>
+    </w:rPr>
+  </w:style>
 </w:styles>
+</file>
+
+<file path=word/theme/theme1.xml><?xml version="1.0" encoding="utf-8"?>
+<a:theme xmlns:a="http://schemas.openxmlformats.org/drawingml/2006/main" name="Office Theme">
+  <a:themeElements>
+    <a:clrScheme name="Office">
+      <a:dk1>
+        <a:sysClr val="windowText" lastClr="000000"/>
+      </a:dk1>
+      <a:lt1>
+        <a:sysClr val="window" lastClr="FFFFFF"/>
+      </a:lt1>
+      <a:dk2>
+        <a:srgbClr val="0E2841"/>
+      </a:dk2>
+      <a:lt2>
+        <a:srgbClr val="E8E8E8"/>
+      </a:lt2>
+      <a:accent1>
+        <a:srgbClr val="156082"/>
+      </a:accent1>
+      <a:accent2>
+        <a:srgbClr val="E97132"/>
+      </a:accent2>
+      <a:accent3>
+        <a:srgbClr val="196B24"/>
+      </a:accent3>
+      <a:accent4>
+        <a:srgbClr val="0F9ED5"/>
+      </a:accent4>
+      <a:accent5>
+        <a:srgbClr val="A02B93"/>
+      </a:accent5>
+      <a:accent6>
+        <a:srgbClr val="4EA72E"/>
+      </a:accent6>
+      <a:hlink>
+        <a:srgbClr val="467886"/>
+      </a:hlink>
+      <a:folHlink>
+        <a:srgbClr val="96607D"/>
+      </a:folHlink>
+    </a:clrScheme>
+    <a:fontScheme name="Office">
+      <a:majorFont>
+        <a:latin typeface="Aptos Display" panose="02110004020202020204"/>
+        <a:ea typeface=""/>
+        <a:cs typeface=""/>
+        <a:font script="Jpan" typeface="游ゴシック Light"/>
+        <a:font script="Hang" typeface="맑은 고딕"/>
+        <a:font script="Hans" typeface="等线 Light"/>
+        <a:font script="Hant" typeface="新細明體"/>
+        <a:font script="Arab" typeface="Times New Roman"/>
+        <a:font script="Hebr" typeface="Times New Roman"/>
+        <a:font script="Thai" typeface="Angsana New"/>
+        <a:font script="Ethi" typeface="Nyala"/>
+        <a:font script="Beng" typeface="Vrinda"/>
+        <a:font script="Gujr" typeface="Shruti"/>
+        <a:font script="Khmr" typeface="MoolBoran"/>
+        <a:font script="Knda" typeface="Tunga"/>
+        <a:font script="Guru" typeface="Raavi"/>
+        <a:font script="Cans" typeface="Euphemia"/>
+        <a:font script="Cher" typeface="Plantagenet Cherokee"/>
+        <a:font script="Yiii" typeface="Microsoft Yi Baiti"/>
+        <a:font script="Tibt" typeface="Microsoft Himalaya"/>
+        <a:font script="Thaa" typeface="MV Boli"/>
+        <a:font script="Deva" typeface="Mangal"/>
+        <a:font script="Telu" typeface="Gautami"/>
+        <a:font script="Taml" typeface="Latha"/>
+        <a:font script="Syrc" typeface="Estrangelo Edessa"/>
+        <a:font script="Orya" typeface="Kalinga"/>
+        <a:font script="Mlym" typeface="Kartika"/>
+        <a:font script="Laoo" typeface="DokChampa"/>
+        <a:font script="Sinh" typeface="Iskoola Pota"/>
+        <a:font script="Mong" typeface="Mongolian Baiti"/>
+        <a:font script="Viet" typeface="Times New Roman"/>
+        <a:font script="Uigh" typeface="Microsoft Uighur"/>
+        <a:font script="Geor" typeface="Sylfaen"/>
+        <a:font script="Armn" typeface="Arial"/>
+        <a:font script="Bugi" typeface="Leelawadee UI"/>
+        <a:font script="Bopo" typeface="Microsoft JhengHei"/>
+        <a:font script="Java" typeface="Javanese Text"/>
+        <a:font script="Lisu" typeface="Segoe UI"/>
+        <a:font script="Mymr" typeface="Myanmar Text"/>
+        <a:font script="Nkoo" typeface="Ebrima"/>
+        <a:font script="Olck" typeface="Nirmala UI"/>
+        <a:font script="Osma" typeface="Ebrima"/>
+        <a:font script="Phag" typeface="Phagspa"/>
+        <a:font script="Syrn" typeface="Estrangelo Edessa"/>
+        <a:font script="Syrj" typeface="Estrangelo Edessa"/>
+        <a:font script="Syre" typeface="Estrangelo Edessa"/>
+        <a:font script="Sora" typeface="Nirmala UI"/>
+        <a:font script="Tale" typeface="Microsoft Tai Le"/>
+        <a:font script="Talu" typeface="Microsoft New Tai Lue"/>
+        <a:font script="Tfng" typeface="Ebrima"/>
+      </a:majorFont>
+      <a:minorFont>
+        <a:latin typeface="Aptos" panose="02110004020202020204"/>
+        <a:ea typeface=""/>
+        <a:cs typeface=""/>
+        <a:font script="Jpan" typeface="游明朝"/>
+        <a:font script="Hang" typeface="맑은 고딕"/>
+        <a:font script="Hans" typeface="等线"/>
+        <a:font script="Hant" typeface="新細明體"/>
+        <a:font script="Arab" typeface="Arial"/>
+        <a:font script="Hebr" typeface="Arial"/>
+        <a:font script="Thai" typeface="Cordia New"/>
+        <a:font script="Ethi" typeface="Nyala"/>
+        <a:font script="Beng" typeface="Vrinda"/>
+        <a:font script="Gujr" typeface="Shruti"/>
+        <a:font script="Khmr" typeface="DaunPenh"/>
+        <a:font script="Knda" typeface="Tunga"/>
+        <a:font script="Guru" typeface="Raavi"/>
+        <a:font script="Cans" typeface="Euphemia"/>
+        <a:font script="Cher" typeface="Plantagenet Cherokee"/>
+        <a:font script="Yiii" typeface="Microsoft Yi Baiti"/>
+        <a:font script="Tibt" typeface="Microsoft Himalaya"/>
+        <a:font script="Thaa" typeface="MV Boli"/>
+        <a:font script="Deva" typeface="Mangal"/>
+        <a:font script="Telu" typeface="Gautami"/>
+        <a:font script="Taml" typeface="Latha"/>
+        <a:font script="Syrc" typeface="Estrangelo Edessa"/>
+        <a:font script="Orya" typeface="Kalinga"/>
+        <a:font script="Mlym" typeface="Kartika"/>
+        <a:font script="Laoo" typeface="DokChampa"/>
+        <a:font script="Sinh" typeface="Iskoola Pota"/>
+        <a:font script="Mong" typeface="Mongolian Baiti"/>
+        <a:font script="Viet" typeface="Arial"/>
+        <a:font script="Uigh" typeface="Microsoft Uighur"/>
+        <a:font script="Geor" typeface="Sylfaen"/>
+        <a:font script="Armn" typeface="Arial"/>
+        <a:font script="Bugi" typeface="Leelawadee UI"/>
+        <a:font script="Bopo" typeface="Microsoft JhengHei"/>
+        <a:font script="Java" typeface="Javanese Text"/>
+        <a:font script="Lisu" typeface="Segoe UI"/>
+        <a:font script="Mymr" typeface="Myanmar Text"/>
+        <a:font script="Nkoo" typeface="Ebrima"/>
+        <a:font script="Olck" typeface="Nirmala UI"/>
+        <a:font script="Osma" typeface="Ebrima"/>
+        <a:font script="Phag" typeface="Phagspa"/>
+        <a:font script="Syrn" typeface="Estrangelo Edessa"/>
+        <a:font script="Syrj" typeface="Estrangelo Edessa"/>
+        <a:font script="Syre" typeface="Estrangelo Edessa"/>
+        <a:font script="Sora" typeface="Nirmala UI"/>
+        <a:font script="Tale" typeface="Microsoft Tai Le"/>
+        <a:font script="Talu" typeface="Microsoft New Tai Lue"/>
+        <a:font script="Tfng" typeface="Ebrima"/>
+      </a:minorFont>
+    </a:fontScheme>
+    <a:fmtScheme name="Office">
+      <a:fillStyleLst>
+        <a:solidFill>
+          <a:schemeClr val="phClr"/>
+        </a:solidFill>
+        <a:gradFill rotWithShape="1">
+          <a:gsLst>
+            <a:gs pos="0">
+              <a:schemeClr val="phClr">
+                <a:lumMod val="110000"/>
+                <a:satMod val="105000"/>
+                <a:tint val="67000"/>
+              </a:schemeClr>
+            </a:gs>
+            <a:gs pos="50000">
+              <a:schemeClr val="phClr">
+                <a:lumMod val="105000"/>
+                <a:satMod val="103000"/>
+                <a:tint val="73000"/>
+              </a:schemeClr>
+            </a:gs>
+            <a:gs pos="100000">
+              <a:schemeClr val="phClr">
+                <a:lumMod val="105000"/>
+                <a:satMod val="109000"/>
+                <a:tint val="81000"/>
+              </a:schemeClr>
+            </a:gs>
+          </a:gsLst>
+          <a:lin ang="5400000" scaled="0"/>
+        </a:gradFill>
+        <a:gradFill rotWithShape="1">
+          <a:gsLst>
+            <a:gs pos="0">
+              <a:schemeClr val="phClr">
+                <a:satMod val="103000"/>
+                <a:lumMod val="102000"/>
+                <a:tint val="94000"/>
+              </a:schemeClr>
+            </a:gs>
+            <a:gs pos="50000">
+              <a:schemeClr val="phClr">
+                <a:satMod val="110000"/>
+                <a:lumMod val="100000"/>
+                <a:shade val="100000"/>
+              </a:schemeClr>
+            </a:gs>
+            <a:gs pos="100000">
+              <a:schemeClr val="phClr">
+                <a:lumMod val="99000"/>
+                <a:satMod val="120000"/>
+                <a:shade val="78000"/>
+              </a:schemeClr>
+            </a:gs>
+          </a:gsLst>
+          <a:lin ang="5400000" scaled="0"/>
+        </a:gradFill>
+      </a:fillStyleLst>
+      <a:lnStyleLst>
+        <a:ln w="12700" cap="flat" cmpd="sng" algn="ctr">
+          <a:solidFill>
+            <a:schemeClr val="phClr"/>
+          </a:solidFill>
+          <a:prstDash val="solid"/>
+          <a:miter lim="800000"/>
+        </a:ln>
+        <a:ln w="19050" cap="flat" cmpd="sng" algn="ctr">
+          <a:solidFill>
+            <a:schemeClr val="phClr"/>
+          </a:solidFill>
+          <a:prstDash val="solid"/>
+          <a:miter lim="800000"/>
+        </a:ln>
+        <a:ln w="25400" cap="flat" cmpd="sng" algn="ctr">
+          <a:solidFill>
+            <a:schemeClr val="phClr"/>
+          </a:solidFill>
+          <a:prstDash val="solid"/>
+          <a:miter lim="800000"/>
+        </a:ln>
+      </a:lnStyleLst>
+      <a:effectStyleLst>
+        <a:effectStyle>
+          <a:effectLst/>
+        </a:effectStyle>
+        <a:effectStyle>
+          <a:effectLst/>
+        </a:effectStyle>
+        <a:effectStyle>
+          <a:effectLst>
+            <a:outerShdw blurRad="57150" dist="19050" dir="5400000" algn="ctr" rotWithShape="0">
+              <a:srgbClr val="000000">
+                <a:alpha val="63000"/>
+              </a:srgbClr>
+            </a:outerShdw>
+          </a:effectLst>
+        </a:effectStyle>
+      </a:effectStyleLst>
+      <a:bgFillStyleLst>
+        <a:solidFill>
+          <a:schemeClr val="phClr"/>
+        </a:solidFill>
+        <a:solidFill>
+          <a:schemeClr val="phClr">
+            <a:tint val="95000"/>
+            <a:satMod val="170000"/>
+          </a:schemeClr>
+        </a:solidFill>
+        <a:gradFill rotWithShape="1">
+          <a:gsLst>
+            <a:gs pos="0">
+              <a:schemeClr val="phClr">
+                <a:tint val="93000"/>
+                <a:satMod val="150000"/>
+                <a:shade val="98000"/>
+                <a:lumMod val="102000"/>
+              </a:schemeClr>
+            </a:gs>
+            <a:gs pos="50000">
+              <a:schemeClr val="phClr">
+                <a:tint val="98000"/>
+                <a:satMod val="130000"/>
+                <a:shade val="90000"/>
+                <a:lumMod val="103000"/>
+              </a:schemeClr>
+            </a:gs>
+            <a:gs pos="100000">
+              <a:schemeClr val="phClr">
+                <a:shade val="63000"/>
+                <a:satMod val="120000"/>
+              </a:schemeClr>
+            </a:gs>
+          </a:gsLst>
+          <a:lin ang="5400000" scaled="0"/>
+        </a:gradFill>
+      </a:bgFillStyleLst>
+    </a:fmtScheme>
+  </a:themeElements>
+  <a:objectDefaults>
+    <a:lnDef>
+      <a:spPr/>
+      <a:bodyPr/>
+      <a:lstStyle/>
+      <a:style>
+        <a:lnRef idx="2">
+          <a:schemeClr val="accent1"/>
+        </a:lnRef>
+        <a:fillRef idx="0">
+          <a:schemeClr val="accent1"/>
+        </a:fillRef>
+        <a:effectRef idx="1">
+          <a:schemeClr val="accent1"/>
+        </a:effectRef>
+        <a:fontRef idx="minor">
+          <a:schemeClr val="tx1"/>
+        </a:fontRef>
+      </a:style>
+    </a:lnDef>
+  </a:objectDefaults>
+  <a:extraClrSchemeLst/>
+  <a:extLst>
+    <a:ext uri="{05A4C25C-085E-4340-85A3-A5531E510DB2}">
+      <thm15:themeFamily xmlns:thm15="http://schemas.microsoft.com/office/thememl/2012/main" name="Office Theme" id="{2E142A2C-CD16-42D6-873A-C26D2A0506FA}" vid="{1BDDFF52-6CD6-40A5-AB3C-68EB2F1E4D0A}"/>
+    </a:ext>
+  </a:extLst>
+</a:theme>
 </file>
</xml_diff>